<commit_message>
relazione: corregge i ritagli delle viste parziali, capitoli su pagina nuova, indice a due livelli, figure con altezza massima
</commit_message>
<xml_diff>
--- a/relazione/relazione.docx
+++ b/relazione/relazione.docx
@@ -139,7 +139,7 @@
           </w:pPr>
           <w:r>
             <w:fldChar w:fldCharType="begin" w:dirty="true"/>
-            <w:instrText xml:space="preserve">TOC \h \o "1-3"</w:instrText>
+            <w:instrText xml:space="preserve">TOC \h \o "1-2"</w:instrText>
             <w:fldChar w:fldCharType="separate"/>
           </w:r>
           <w:hyperlink w:history="1" w:anchor="_Toc1">
@@ -203,14 +203,14 @@
         </w:p>
         <w:p>
           <w:pPr>
-            <w:pStyle w:val="TOC3"/>
+            <w:pStyle w:val="TOC2"/>
             <w:tabs>
               <w:tab w:val="right" w:pos="9638" w:leader="dot"/>
             </w:tabs>
           </w:pPr>
           <w:hyperlink w:history="1" w:anchor="_Toc4">
             <w:r>
-              <w:t xml:space="preserve">Un carico variabile e imprevedibile</w:t>
+              <w:t xml:space="preserve">1.3 I requisiti</w:t>
             </w:r>
             <w:r>
               <w:tab/>
@@ -225,14 +225,14 @@
         </w:p>
         <w:p>
           <w:pPr>
-            <w:pStyle w:val="TOC3"/>
+            <w:pStyle w:val="TOC1"/>
             <w:tabs>
               <w:tab w:val="right" w:pos="9638" w:leader="dot"/>
             </w:tabs>
           </w:pPr>
           <w:hyperlink w:history="1" w:anchor="_Toc5">
             <w:r>
-              <w:t xml:space="preserve">File grandi</w:t>
+              <w:t xml:space="preserve">2. La soluzione in sintesi</w:t>
             </w:r>
             <w:r>
               <w:tab/>
@@ -247,14 +247,14 @@
         </w:p>
         <w:p>
           <w:pPr>
-            <w:pStyle w:val="TOC3"/>
+            <w:pStyle w:val="TOC2"/>
             <w:tabs>
               <w:tab w:val="right" w:pos="9638" w:leader="dot"/>
             </w:tabs>
           </w:pPr>
           <w:hyperlink w:history="1" w:anchor="_Toc6">
             <w:r>
-              <w:t xml:space="preserve">Dati personali da proteggere</w:t>
+              <w:t xml:space="preserve">2.1 L'idea e il diagramma</w:t>
             </w:r>
             <w:r>
               <w:tab/>
@@ -269,14 +269,14 @@
         </w:p>
         <w:p>
           <w:pPr>
-            <w:pStyle w:val="TOC3"/>
+            <w:pStyle w:val="TOC2"/>
             <w:tabs>
               <w:tab w:val="right" w:pos="9638" w:leader="dot"/>
             </w:tabs>
           </w:pPr>
           <w:hyperlink w:history="1" w:anchor="_Toc7">
             <w:r>
-              <w:t xml:space="preserve">Costi bassi, senza utenti fissi</w:t>
+              <w:t xml:space="preserve">2.2 Dai requisiti alla soluzione</w:t>
             </w:r>
             <w:r>
               <w:tab/>
@@ -291,14 +291,14 @@
         </w:p>
         <w:p>
           <w:pPr>
-            <w:pStyle w:val="TOC3"/>
+            <w:pStyle w:val="TOC2"/>
             <w:tabs>
               <w:tab w:val="right" w:pos="9638" w:leader="dot"/>
             </w:tabs>
           </w:pPr>
           <w:hyperlink w:history="1" w:anchor="_Toc8">
             <w:r>
-              <w:t xml:space="preserve">Nessun server da gestire</w:t>
+              <w:t xml:space="preserve">2.3 Le scelte di fondo</w:t>
             </w:r>
             <w:r>
               <w:tab/>
@@ -313,14 +313,14 @@
         </w:p>
         <w:p>
           <w:pPr>
-            <w:pStyle w:val="TOC3"/>
+            <w:pStyle w:val="TOC1"/>
             <w:tabs>
               <w:tab w:val="right" w:pos="9638" w:leader="dot"/>
             </w:tabs>
           </w:pPr>
           <w:hyperlink w:history="1" w:anchor="_Toc9">
             <w:r>
-              <w:t xml:space="preserve">Disponibile anche se cade una zona</w:t>
+              <w:t xml:space="preserve">3. Come comunicano i componenti</w:t>
             </w:r>
             <w:r>
               <w:tab/>
@@ -342,7 +342,7 @@
           </w:pPr>
           <w:hyperlink w:history="1" w:anchor="_Toc10">
             <w:r>
-              <w:t xml:space="preserve">1.3 I requisiti</w:t>
+              <w:t xml:space="preserve">3.1 Scaricare l'applicazione</w:t>
             </w:r>
             <w:r>
               <w:tab/>
@@ -357,14 +357,14 @@
         </w:p>
         <w:p>
           <w:pPr>
-            <w:pStyle w:val="TOC1"/>
+            <w:pStyle w:val="TOC2"/>
             <w:tabs>
               <w:tab w:val="right" w:pos="9638" w:leader="dot"/>
             </w:tabs>
           </w:pPr>
           <w:hyperlink w:history="1" w:anchor="_Toc11">
             <w:r>
-              <w:t xml:space="preserve">2. La soluzione in sintesi</w:t>
+              <w:t xml:space="preserve">3.2 Login e chiamate all'API</w:t>
             </w:r>
             <w:r>
               <w:tab/>
@@ -386,7 +386,7 @@
           </w:pPr>
           <w:hyperlink w:history="1" w:anchor="_Toc12">
             <w:r>
-              <w:t xml:space="preserve">2.1 L'idea e il diagramma</w:t>
+              <w:t xml:space="preserve">3.3 Dalla Lambda al database</w:t>
             </w:r>
             <w:r>
               <w:tab/>
@@ -401,14 +401,14 @@
         </w:p>
         <w:p>
           <w:pPr>
-            <w:pStyle w:val="TOC3"/>
+            <w:pStyle w:val="TOC2"/>
             <w:tabs>
               <w:tab w:val="right" w:pos="9638" w:leader="dot"/>
             </w:tabs>
           </w:pPr>
           <w:hyperlink w:history="1" w:anchor="_Toc13">
             <w:r>
-              <w:t xml:space="preserve">Un esempio: un'offerta</w:t>
+              <w:t xml:space="preserve">3.4 Caricare e servire i file</w:t>
             </w:r>
             <w:r>
               <w:tab/>
@@ -430,7 +430,7 @@
           </w:pPr>
           <w:hyperlink w:history="1" w:anchor="_Toc14">
             <w:r>
-              <w:t xml:space="preserve">2.2 Dai requisiti alla soluzione</w:t>
+              <w:t xml:space="preserve">3.5 Le notifiche email e la dead-letter queue</w:t>
             </w:r>
             <w:r>
               <w:tab/>
@@ -452,7 +452,7 @@
           </w:pPr>
           <w:hyperlink w:history="1" w:anchor="_Toc15">
             <w:r>
-              <w:t xml:space="preserve">2.3 Le scelte di fondo</w:t>
+              <w:t xml:space="preserve">3.6 Gestione e cancellazione dell'account</w:t>
             </w:r>
             <w:r>
               <w:tab/>
@@ -467,14 +467,14 @@
         </w:p>
         <w:p>
           <w:pPr>
-            <w:pStyle w:val="TOC3"/>
+            <w:pStyle w:val="TOC2"/>
             <w:tabs>
               <w:tab w:val="right" w:pos="9638" w:leader="dot"/>
             </w:tabs>
           </w:pPr>
           <w:hyperlink w:history="1" w:anchor="_Toc16">
             <w:r>
-              <w:t xml:space="preserve">Serverless</w:t>
+              <w:t xml:space="preserve">3.7 Log, metriche e allarmi</w:t>
             </w:r>
             <w:r>
               <w:tab/>
@@ -482,72 +482,6 @@
             <w:r>
               <w:fldChar w:fldCharType="begin" w:dirty="true"/>
               <w:instrText xml:space="preserve">PAGEREF _Toc16 \h</w:instrText>
-              <w:fldChar w:fldCharType="separate"/>
-              <w:fldChar w:fldCharType="end"/>
-            </w:r>
-          </w:hyperlink>
-        </w:p>
-        <w:p>
-          <w:pPr>
-            <w:pStyle w:val="TOC3"/>
-            <w:tabs>
-              <w:tab w:val="right" w:pos="9638" w:leader="dot"/>
-            </w:tabs>
-          </w:pPr>
-          <w:hyperlink w:history="1" w:anchor="_Toc17">
-            <w:r>
-              <w:t xml:space="preserve">Una regione, due zone</w:t>
-            </w:r>
-            <w:r>
-              <w:tab/>
-            </w:r>
-            <w:r>
-              <w:fldChar w:fldCharType="begin" w:dirty="true"/>
-              <w:instrText xml:space="preserve">PAGEREF _Toc17 \h</w:instrText>
-              <w:fldChar w:fldCharType="separate"/>
-              <w:fldChar w:fldCharType="end"/>
-            </w:r>
-          </w:hyperlink>
-        </w:p>
-        <w:p>
-          <w:pPr>
-            <w:pStyle w:val="TOC3"/>
-            <w:tabs>
-              <w:tab w:val="right" w:pos="9638" w:leader="dot"/>
-            </w:tabs>
-          </w:pPr>
-          <w:hyperlink w:history="1" w:anchor="_Toc18">
-            <w:r>
-              <w:t xml:space="preserve">Una VPC senza Internet Gateway né NAT</w:t>
-            </w:r>
-            <w:r>
-              <w:tab/>
-            </w:r>
-            <w:r>
-              <w:fldChar w:fldCharType="begin" w:dirty="true"/>
-              <w:instrText xml:space="preserve">PAGEREF _Toc18 \h</w:instrText>
-              <w:fldChar w:fldCharType="separate"/>
-              <w:fldChar w:fldCharType="end"/>
-            </w:r>
-          </w:hyperlink>
-        </w:p>
-        <w:p>
-          <w:pPr>
-            <w:pStyle w:val="TOC3"/>
-            <w:tabs>
-              <w:tab w:val="right" w:pos="9638" w:leader="dot"/>
-            </w:tabs>
-          </w:pPr>
-          <w:hyperlink w:history="1" w:anchor="_Toc19">
-            <w:r>
-              <w:t xml:space="preserve">Sincrono e asincrono</w:t>
-            </w:r>
-            <w:r>
-              <w:tab/>
-            </w:r>
-            <w:r>
-              <w:fldChar w:fldCharType="begin" w:dirty="true"/>
-              <w:instrText xml:space="preserve">PAGEREF _Toc19 \h</w:instrText>
               <w:fldChar w:fldCharType="separate"/>
               <w:fldChar w:fldCharType="end"/>
             </w:r>
@@ -560,9 +494,75 @@
               <w:tab w:val="right" w:pos="9638" w:leader="dot"/>
             </w:tabs>
           </w:pPr>
+          <w:hyperlink w:history="1" w:anchor="_Toc17">
+            <w:r>
+              <w:t xml:space="preserve">4. Sicurezza e IAM</w:t>
+            </w:r>
+            <w:r>
+              <w:tab/>
+            </w:r>
+            <w:r>
+              <w:fldChar w:fldCharType="begin" w:dirty="true"/>
+              <w:instrText xml:space="preserve">PAGEREF _Toc17 \h</w:instrText>
+              <w:fldChar w:fldCharType="separate"/>
+              <w:fldChar w:fldCharType="end"/>
+            </w:r>
+          </w:hyperlink>
+        </w:p>
+        <w:p>
+          <w:pPr>
+            <w:pStyle w:val="TOC2"/>
+            <w:tabs>
+              <w:tab w:val="right" w:pos="9638" w:leader="dot"/>
+            </w:tabs>
+          </w:pPr>
+          <w:hyperlink w:history="1" w:anchor="_Toc18">
+            <w:r>
+              <w:t xml:space="preserve">4.1 Le tre facce di IAM</w:t>
+            </w:r>
+            <w:r>
+              <w:tab/>
+            </w:r>
+            <w:r>
+              <w:fldChar w:fldCharType="begin" w:dirty="true"/>
+              <w:instrText xml:space="preserve">PAGEREF _Toc18 \h</w:instrText>
+              <w:fldChar w:fldCharType="separate"/>
+              <w:fldChar w:fldCharType="end"/>
+            </w:r>
+          </w:hyperlink>
+        </w:p>
+        <w:p>
+          <w:pPr>
+            <w:pStyle w:val="TOC2"/>
+            <w:tabs>
+              <w:tab w:val="right" w:pos="9638" w:leader="dot"/>
+            </w:tabs>
+          </w:pPr>
+          <w:hyperlink w:history="1" w:anchor="_Toc19">
+            <w:r>
+              <w:t xml:space="preserve">4.2 La rete come secondo livello</w:t>
+            </w:r>
+            <w:r>
+              <w:tab/>
+            </w:r>
+            <w:r>
+              <w:fldChar w:fldCharType="begin" w:dirty="true"/>
+              <w:instrText xml:space="preserve">PAGEREF _Toc19 \h</w:instrText>
+              <w:fldChar w:fldCharType="separate"/>
+              <w:fldChar w:fldCharType="end"/>
+            </w:r>
+          </w:hyperlink>
+        </w:p>
+        <w:p>
+          <w:pPr>
+            <w:pStyle w:val="TOC2"/>
+            <w:tabs>
+              <w:tab w:val="right" w:pos="9638" w:leader="dot"/>
+            </w:tabs>
+          </w:pPr>
           <w:hyperlink w:history="1" w:anchor="_Toc20">
             <w:r>
-              <w:t xml:space="preserve">3. Come comunicano i componenti</w:t>
+              <w:t xml:space="preserve">4.3 La mappa delle autorizzazioni</w:t>
             </w:r>
             <w:r>
               <w:tab/>
@@ -577,14 +577,14 @@
         </w:p>
         <w:p>
           <w:pPr>
-            <w:pStyle w:val="TOC3"/>
+            <w:pStyle w:val="TOC1"/>
             <w:tabs>
               <w:tab w:val="right" w:pos="9638" w:leader="dot"/>
             </w:tabs>
           </w:pPr>
           <w:hyperlink w:history="1" w:anchor="_Toc21">
             <w:r>
-              <w:t xml:space="preserve">Lo schema comune</w:t>
+              <w:t xml:space="preserve">5. Decisioni, alternative e limiti</w:t>
             </w:r>
             <w:r>
               <w:tab/>
@@ -599,14 +599,14 @@
         </w:p>
         <w:p>
           <w:pPr>
-            <w:pStyle w:val="TOC3"/>
+            <w:pStyle w:val="TOC2"/>
             <w:tabs>
               <w:tab w:val="right" w:pos="9638" w:leader="dot"/>
             </w:tabs>
           </w:pPr>
           <w:hyperlink w:history="1" w:anchor="_Toc22">
             <w:r>
-              <w:t xml:space="preserve">I sette flussi</w:t>
+              <w:t xml:space="preserve">5.1 Le decisioni principali</w:t>
             </w:r>
             <w:r>
               <w:tab/>
@@ -628,7 +628,7 @@
           </w:pPr>
           <w:hyperlink w:history="1" w:anchor="_Toc23">
             <w:r>
-              <w:t xml:space="preserve">3.1 Scaricare l'applicazione</w:t>
+              <w:t xml:space="preserve">5.2 Limiti e rischi dichiarati</w:t>
             </w:r>
             <w:r>
               <w:tab/>
@@ -636,116 +636,6 @@
             <w:r>
               <w:fldChar w:fldCharType="begin" w:dirty="true"/>
               <w:instrText xml:space="preserve">PAGEREF _Toc23 \h</w:instrText>
-              <w:fldChar w:fldCharType="separate"/>
-              <w:fldChar w:fldCharType="end"/>
-            </w:r>
-          </w:hyperlink>
-        </w:p>
-        <w:p>
-          <w:pPr>
-            <w:pStyle w:val="TOC3"/>
-            <w:tabs>
-              <w:tab w:val="right" w:pos="9638" w:leader="dot"/>
-            </w:tabs>
-          </w:pPr>
-          <w:hyperlink w:history="1" w:anchor="_Toc24">
-            <w:r>
-              <w:t xml:space="preserve">Il percorso</w:t>
-            </w:r>
-            <w:r>
-              <w:tab/>
-            </w:r>
-            <w:r>
-              <w:fldChar w:fldCharType="begin" w:dirty="true"/>
-              <w:instrText xml:space="preserve">PAGEREF _Toc24 \h</w:instrText>
-              <w:fldChar w:fldCharType="separate"/>
-              <w:fldChar w:fldCharType="end"/>
-            </w:r>
-          </w:hyperlink>
-        </w:p>
-        <w:p>
-          <w:pPr>
-            <w:pStyle w:val="TOC3"/>
-            <w:tabs>
-              <w:tab w:val="right" w:pos="9638" w:leader="dot"/>
-            </w:tabs>
-          </w:pPr>
-          <w:hyperlink w:history="1" w:anchor="_Toc25">
-            <w:r>
-              <w:t xml:space="preserve">Chi parla con chi</w:t>
-            </w:r>
-            <w:r>
-              <w:tab/>
-            </w:r>
-            <w:r>
-              <w:fldChar w:fldCharType="begin" w:dirty="true"/>
-              <w:instrText xml:space="preserve">PAGEREF _Toc25 \h</w:instrText>
-              <w:fldChar w:fldCharType="separate"/>
-              <w:fldChar w:fldCharType="end"/>
-            </w:r>
-          </w:hyperlink>
-        </w:p>
-        <w:p>
-          <w:pPr>
-            <w:pStyle w:val="TOC3"/>
-            <w:tabs>
-              <w:tab w:val="right" w:pos="9638" w:leader="dot"/>
-            </w:tabs>
-          </w:pPr>
-          <w:hyperlink w:history="1" w:anchor="_Toc26">
-            <w:r>
-              <w:t xml:space="preserve">L'autorizzazione chiave</w:t>
-            </w:r>
-            <w:r>
-              <w:tab/>
-            </w:r>
-            <w:r>
-              <w:fldChar w:fldCharType="begin" w:dirty="true"/>
-              <w:instrText xml:space="preserve">PAGEREF _Toc26 \h</w:instrText>
-              <w:fldChar w:fldCharType="separate"/>
-              <w:fldChar w:fldCharType="end"/>
-            </w:r>
-          </w:hyperlink>
-        </w:p>
-        <w:p>
-          <w:pPr>
-            <w:pStyle w:val="TOC3"/>
-            <w:tabs>
-              <w:tab w:val="right" w:pos="9638" w:leader="dot"/>
-            </w:tabs>
-          </w:pPr>
-          <w:hyperlink w:history="1" w:anchor="_Toc27">
-            <w:r>
-              <w:t xml:space="preserve">Quando qualcosa va storto</w:t>
-            </w:r>
-            <w:r>
-              <w:tab/>
-            </w:r>
-            <w:r>
-              <w:fldChar w:fldCharType="begin" w:dirty="true"/>
-              <w:instrText xml:space="preserve">PAGEREF _Toc27 \h</w:instrText>
-              <w:fldChar w:fldCharType="separate"/>
-              <w:fldChar w:fldCharType="end"/>
-            </w:r>
-          </w:hyperlink>
-        </w:p>
-        <w:p>
-          <w:pPr>
-            <w:pStyle w:val="TOC3"/>
-            <w:tabs>
-              <w:tab w:val="right" w:pos="9638" w:leader="dot"/>
-            </w:tabs>
-          </w:pPr>
-          <w:hyperlink w:history="1" w:anchor="_Toc28">
-            <w:r>
-              <w:t xml:space="preserve">Le scelte</w:t>
-            </w:r>
-            <w:r>
-              <w:tab/>
-            </w:r>
-            <w:r>
-              <w:fldChar w:fldCharType="begin" w:dirty="true"/>
-              <w:instrText xml:space="preserve">PAGEREF _Toc28 \h</w:instrText>
               <w:fldChar w:fldCharType="separate"/>
               <w:fldChar w:fldCharType="end"/>
             </w:r>
@@ -758,16 +648,16 @@
               <w:tab w:val="right" w:pos="9638" w:leader="dot"/>
             </w:tabs>
           </w:pPr>
-          <w:hyperlink w:history="1" w:anchor="_Toc29">
-            <w:r>
-              <w:t xml:space="preserve">3.2 Login e chiamate all'API</w:t>
+          <w:hyperlink w:history="1" w:anchor="_Toc24">
+            <w:r>
+              <w:t xml:space="preserve">5.3 Sviluppi possibili</w:t>
             </w:r>
             <w:r>
               <w:tab/>
             </w:r>
             <w:r>
               <w:fldChar w:fldCharType="begin" w:dirty="true"/>
-              <w:instrText xml:space="preserve">PAGEREF _Toc29 \h</w:instrText>
+              <w:instrText xml:space="preserve">PAGEREF _Toc24 \h</w:instrText>
               <w:fldChar w:fldCharType="separate"/>
               <w:fldChar w:fldCharType="end"/>
             </w:r>
@@ -775,197 +665,21 @@
         </w:p>
         <w:p>
           <w:pPr>
-            <w:pStyle w:val="TOC3"/>
+            <w:pStyle w:val="TOC1"/>
             <w:tabs>
               <w:tab w:val="right" w:pos="9638" w:leader="dot"/>
             </w:tabs>
           </w:pPr>
-          <w:hyperlink w:history="1" w:anchor="_Toc30">
-            <w:r>
-              <w:t xml:space="preserve">Il percorso</w:t>
+          <w:hyperlink w:history="1" w:anchor="_Toc25">
+            <w:r>
+              <w:t xml:space="preserve">Appendice A — Ruoli e policy</w:t>
             </w:r>
             <w:r>
               <w:tab/>
             </w:r>
             <w:r>
               <w:fldChar w:fldCharType="begin" w:dirty="true"/>
-              <w:instrText xml:space="preserve">PAGEREF _Toc30 \h</w:instrText>
-              <w:fldChar w:fldCharType="separate"/>
-              <w:fldChar w:fldCharType="end"/>
-            </w:r>
-          </w:hyperlink>
-        </w:p>
-        <w:p>
-          <w:pPr>
-            <w:pStyle w:val="TOC3"/>
-            <w:tabs>
-              <w:tab w:val="right" w:pos="9638" w:leader="dot"/>
-            </w:tabs>
-          </w:pPr>
-          <w:hyperlink w:history="1" w:anchor="_Toc31">
-            <w:r>
-              <w:t xml:space="preserve">Chi parla con chi</w:t>
-            </w:r>
-            <w:r>
-              <w:tab/>
-            </w:r>
-            <w:r>
-              <w:fldChar w:fldCharType="begin" w:dirty="true"/>
-              <w:instrText xml:space="preserve">PAGEREF _Toc31 \h</w:instrText>
-              <w:fldChar w:fldCharType="separate"/>
-              <w:fldChar w:fldCharType="end"/>
-            </w:r>
-          </w:hyperlink>
-        </w:p>
-        <w:p>
-          <w:pPr>
-            <w:pStyle w:val="TOC3"/>
-            <w:tabs>
-              <w:tab w:val="right" w:pos="9638" w:leader="dot"/>
-            </w:tabs>
-          </w:pPr>
-          <w:hyperlink w:history="1" w:anchor="_Toc32">
-            <w:r>
-              <w:t xml:space="preserve">I token</w:t>
-            </w:r>
-            <w:r>
-              <w:tab/>
-            </w:r>
-            <w:r>
-              <w:fldChar w:fldCharType="begin" w:dirty="true"/>
-              <w:instrText xml:space="preserve">PAGEREF _Toc32 \h</w:instrText>
-              <w:fldChar w:fldCharType="separate"/>
-              <w:fldChar w:fldCharType="end"/>
-            </w:r>
-          </w:hyperlink>
-        </w:p>
-        <w:p>
-          <w:pPr>
-            <w:pStyle w:val="TOC3"/>
-            <w:tabs>
-              <w:tab w:val="right" w:pos="9638" w:leader="dot"/>
-            </w:tabs>
-          </w:pPr>
-          <w:hyperlink w:history="1" w:anchor="_Toc33">
-            <w:r>
-              <w:t xml:space="preserve">L'authorizer JWT</w:t>
-            </w:r>
-            <w:r>
-              <w:tab/>
-            </w:r>
-            <w:r>
-              <w:fldChar w:fldCharType="begin" w:dirty="true"/>
-              <w:instrText xml:space="preserve">PAGEREF _Toc33 \h</w:instrText>
-              <w:fldChar w:fldCharType="separate"/>
-              <w:fldChar w:fldCharType="end"/>
-            </w:r>
-          </w:hyperlink>
-        </w:p>
-        <w:p>
-          <w:pPr>
-            <w:pStyle w:val="TOC3"/>
-            <w:tabs>
-              <w:tab w:val="right" w:pos="9638" w:leader="dot"/>
-            </w:tabs>
-          </w:pPr>
-          <w:hyperlink w:history="1" w:anchor="_Toc34">
-            <w:r>
-              <w:t xml:space="preserve">Chi può invocare la Lambda</w:t>
-            </w:r>
-            <w:r>
-              <w:tab/>
-            </w:r>
-            <w:r>
-              <w:fldChar w:fldCharType="begin" w:dirty="true"/>
-              <w:instrText xml:space="preserve">PAGEREF _Toc34 \h</w:instrText>
-              <w:fldChar w:fldCharType="separate"/>
-              <w:fldChar w:fldCharType="end"/>
-            </w:r>
-          </w:hyperlink>
-        </w:p>
-        <w:p>
-          <w:pPr>
-            <w:pStyle w:val="TOC3"/>
-            <w:tabs>
-              <w:tab w:val="right" w:pos="9638" w:leader="dot"/>
-            </w:tabs>
-          </w:pPr>
-          <w:hyperlink w:history="1" w:anchor="_Toc35">
-            <w:r>
-              <w:t xml:space="preserve">Cosa decide la Lambda</w:t>
-            </w:r>
-            <w:r>
-              <w:tab/>
-            </w:r>
-            <w:r>
-              <w:fldChar w:fldCharType="begin" w:dirty="true"/>
-              <w:instrText xml:space="preserve">PAGEREF _Toc35 \h</w:instrText>
-              <w:fldChar w:fldCharType="separate"/>
-              <w:fldChar w:fldCharType="end"/>
-            </w:r>
-          </w:hyperlink>
-        </w:p>
-        <w:p>
-          <w:pPr>
-            <w:pStyle w:val="TOC3"/>
-            <w:tabs>
-              <w:tab w:val="right" w:pos="9638" w:leader="dot"/>
-            </w:tabs>
-          </w:pPr>
-          <w:hyperlink w:history="1" w:anchor="_Toc36">
-            <w:r>
-              <w:t xml:space="preserve">Quando qualcosa va storto</w:t>
-            </w:r>
-            <w:r>
-              <w:tab/>
-            </w:r>
-            <w:r>
-              <w:fldChar w:fldCharType="begin" w:dirty="true"/>
-              <w:instrText xml:space="preserve">PAGEREF _Toc36 \h</w:instrText>
-              <w:fldChar w:fldCharType="separate"/>
-              <w:fldChar w:fldCharType="end"/>
-            </w:r>
-          </w:hyperlink>
-        </w:p>
-        <w:p>
-          <w:pPr>
-            <w:pStyle w:val="TOC3"/>
-            <w:tabs>
-              <w:tab w:val="right" w:pos="9638" w:leader="dot"/>
-            </w:tabs>
-          </w:pPr>
-          <w:hyperlink w:history="1" w:anchor="_Toc37">
-            <w:r>
-              <w:t xml:space="preserve">Furto del token e rischio residuo</w:t>
-            </w:r>
-            <w:r>
-              <w:tab/>
-            </w:r>
-            <w:r>
-              <w:fldChar w:fldCharType="begin" w:dirty="true"/>
-              <w:instrText xml:space="preserve">PAGEREF _Toc37 \h</w:instrText>
-              <w:fldChar w:fldCharType="separate"/>
-              <w:fldChar w:fldCharType="end"/>
-            </w:r>
-          </w:hyperlink>
-        </w:p>
-        <w:p>
-          <w:pPr>
-            <w:pStyle w:val="TOC3"/>
-            <w:tabs>
-              <w:tab w:val="right" w:pos="9638" w:leader="dot"/>
-            </w:tabs>
-          </w:pPr>
-          <w:hyperlink w:history="1" w:anchor="_Toc38">
-            <w:r>
-              <w:t xml:space="preserve">Le scelte</w:t>
-            </w:r>
-            <w:r>
-              <w:tab/>
-            </w:r>
-            <w:r>
-              <w:fldChar w:fldCharType="begin" w:dirty="true"/>
-              <w:instrText xml:space="preserve">PAGEREF _Toc38 \h</w:instrText>
+              <w:instrText xml:space="preserve">PAGEREF _Toc25 \h</w:instrText>
               <w:fldChar w:fldCharType="separate"/>
               <w:fldChar w:fldCharType="end"/>
             </w:r>
@@ -978,126 +692,16 @@
               <w:tab w:val="right" w:pos="9638" w:leader="dot"/>
             </w:tabs>
           </w:pPr>
-          <w:hyperlink w:history="1" w:anchor="_Toc39">
-            <w:r>
-              <w:t xml:space="preserve">3.3 Dalla Lambda al database</w:t>
+          <w:hyperlink w:history="1" w:anchor="_Toc26">
+            <w:r>
+              <w:t xml:space="preserve">A.1 I ruoli</w:t>
             </w:r>
             <w:r>
               <w:tab/>
             </w:r>
             <w:r>
               <w:fldChar w:fldCharType="begin" w:dirty="true"/>
-              <w:instrText xml:space="preserve">PAGEREF _Toc39 \h</w:instrText>
-              <w:fldChar w:fldCharType="separate"/>
-              <w:fldChar w:fldCharType="end"/>
-            </w:r>
-          </w:hyperlink>
-        </w:p>
-        <w:p>
-          <w:pPr>
-            <w:pStyle w:val="TOC3"/>
-            <w:tabs>
-              <w:tab w:val="right" w:pos="9638" w:leader="dot"/>
-            </w:tabs>
-          </w:pPr>
-          <w:hyperlink w:history="1" w:anchor="_Toc40">
-            <w:r>
-              <w:t xml:space="preserve">Il percorso</w:t>
-            </w:r>
-            <w:r>
-              <w:tab/>
-            </w:r>
-            <w:r>
-              <w:fldChar w:fldCharType="begin" w:dirty="true"/>
-              <w:instrText xml:space="preserve">PAGEREF _Toc40 \h</w:instrText>
-              <w:fldChar w:fldCharType="separate"/>
-              <w:fldChar w:fldCharType="end"/>
-            </w:r>
-          </w:hyperlink>
-        </w:p>
-        <w:p>
-          <w:pPr>
-            <w:pStyle w:val="TOC3"/>
-            <w:tabs>
-              <w:tab w:val="right" w:pos="9638" w:leader="dot"/>
-            </w:tabs>
-          </w:pPr>
-          <w:hyperlink w:history="1" w:anchor="_Toc41">
-            <w:r>
-              <w:t xml:space="preserve">Chi parla con chi</w:t>
-            </w:r>
-            <w:r>
-              <w:tab/>
-            </w:r>
-            <w:r>
-              <w:fldChar w:fldCharType="begin" w:dirty="true"/>
-              <w:instrText xml:space="preserve">PAGEREF _Toc41 \h</w:instrText>
-              <w:fldChar w:fldCharType="separate"/>
-              <w:fldChar w:fldCharType="end"/>
-            </w:r>
-          </w:hyperlink>
-        </w:p>
-        <w:p>
-          <w:pPr>
-            <w:pStyle w:val="TOC3"/>
-            <w:tabs>
-              <w:tab w:val="right" w:pos="9638" w:leader="dot"/>
-            </w:tabs>
-          </w:pPr>
-          <w:hyperlink w:history="1" w:anchor="_Toc42">
-            <w:r>
-              <w:t xml:space="preserve">Le autorizzazioni</w:t>
-            </w:r>
-            <w:r>
-              <w:tab/>
-            </w:r>
-            <w:r>
-              <w:fldChar w:fldCharType="begin" w:dirty="true"/>
-              <w:instrText xml:space="preserve">PAGEREF _Toc42 \h</w:instrText>
-              <w:fldChar w:fldCharType="separate"/>
-              <w:fldChar w:fldCharType="end"/>
-            </w:r>
-          </w:hyperlink>
-        </w:p>
-        <w:p>
-          <w:pPr>
-            <w:pStyle w:val="TOC3"/>
-            <w:tabs>
-              <w:tab w:val="right" w:pos="9638" w:leader="dot"/>
-            </w:tabs>
-          </w:pPr>
-          <w:hyperlink w:history="1" w:anchor="_Toc43">
-            <w:r>
-              <w:t xml:space="preserve">Quando qualcosa va storto</w:t>
-            </w:r>
-            <w:r>
-              <w:tab/>
-            </w:r>
-            <w:r>
-              <w:fldChar w:fldCharType="begin" w:dirty="true"/>
-              <w:instrText xml:space="preserve">PAGEREF _Toc43 \h</w:instrText>
-              <w:fldChar w:fldCharType="separate"/>
-              <w:fldChar w:fldCharType="end"/>
-            </w:r>
-          </w:hyperlink>
-        </w:p>
-        <w:p>
-          <w:pPr>
-            <w:pStyle w:val="TOC3"/>
-            <w:tabs>
-              <w:tab w:val="right" w:pos="9638" w:leader="dot"/>
-            </w:tabs>
-          </w:pPr>
-          <w:hyperlink w:history="1" w:anchor="_Toc44">
-            <w:r>
-              <w:t xml:space="preserve">Le scelte</w:t>
-            </w:r>
-            <w:r>
-              <w:tab/>
-            </w:r>
-            <w:r>
-              <w:fldChar w:fldCharType="begin" w:dirty="true"/>
-              <w:instrText xml:space="preserve">PAGEREF _Toc44 \h</w:instrText>
+              <w:instrText xml:space="preserve">PAGEREF _Toc26 \h</w:instrText>
               <w:fldChar w:fldCharType="separate"/>
               <w:fldChar w:fldCharType="end"/>
             </w:r>
@@ -1110,126 +714,16 @@
               <w:tab w:val="right" w:pos="9638" w:leader="dot"/>
             </w:tabs>
           </w:pPr>
-          <w:hyperlink w:history="1" w:anchor="_Toc45">
-            <w:r>
-              <w:t xml:space="preserve">3.4 Caricare e servire i file</w:t>
+          <w:hyperlink w:history="1" w:anchor="_Toc27">
+            <w:r>
+              <w:t xml:space="preserve">A.2 Le resource policy</w:t>
             </w:r>
             <w:r>
               <w:tab/>
             </w:r>
             <w:r>
               <w:fldChar w:fldCharType="begin" w:dirty="true"/>
-              <w:instrText xml:space="preserve">PAGEREF _Toc45 \h</w:instrText>
-              <w:fldChar w:fldCharType="separate"/>
-              <w:fldChar w:fldCharType="end"/>
-            </w:r>
-          </w:hyperlink>
-        </w:p>
-        <w:p>
-          <w:pPr>
-            <w:pStyle w:val="TOC3"/>
-            <w:tabs>
-              <w:tab w:val="right" w:pos="9638" w:leader="dot"/>
-            </w:tabs>
-          </w:pPr>
-          <w:hyperlink w:history="1" w:anchor="_Toc46">
-            <w:r>
-              <w:t xml:space="preserve">Il percorso</w:t>
-            </w:r>
-            <w:r>
-              <w:tab/>
-            </w:r>
-            <w:r>
-              <w:fldChar w:fldCharType="begin" w:dirty="true"/>
-              <w:instrText xml:space="preserve">PAGEREF _Toc46 \h</w:instrText>
-              <w:fldChar w:fldCharType="separate"/>
-              <w:fldChar w:fldCharType="end"/>
-            </w:r>
-          </w:hyperlink>
-        </w:p>
-        <w:p>
-          <w:pPr>
-            <w:pStyle w:val="TOC3"/>
-            <w:tabs>
-              <w:tab w:val="right" w:pos="9638" w:leader="dot"/>
-            </w:tabs>
-          </w:pPr>
-          <w:hyperlink w:history="1" w:anchor="_Toc47">
-            <w:r>
-              <w:t xml:space="preserve">Chi parla con chi</w:t>
-            </w:r>
-            <w:r>
-              <w:tab/>
-            </w:r>
-            <w:r>
-              <w:fldChar w:fldCharType="begin" w:dirty="true"/>
-              <w:instrText xml:space="preserve">PAGEREF _Toc47 \h</w:instrText>
-              <w:fldChar w:fldCharType="separate"/>
-              <w:fldChar w:fldCharType="end"/>
-            </w:r>
-          </w:hyperlink>
-        </w:p>
-        <w:p>
-          <w:pPr>
-            <w:pStyle w:val="TOC3"/>
-            <w:tabs>
-              <w:tab w:val="right" w:pos="9638" w:leader="dot"/>
-            </w:tabs>
-          </w:pPr>
-          <w:hyperlink w:history="1" w:anchor="_Toc48">
-            <w:r>
-              <w:t xml:space="preserve">Le autorizzazioni</w:t>
-            </w:r>
-            <w:r>
-              <w:tab/>
-            </w:r>
-            <w:r>
-              <w:fldChar w:fldCharType="begin" w:dirty="true"/>
-              <w:instrText xml:space="preserve">PAGEREF _Toc48 \h</w:instrText>
-              <w:fldChar w:fldCharType="separate"/>
-              <w:fldChar w:fldCharType="end"/>
-            </w:r>
-          </w:hyperlink>
-        </w:p>
-        <w:p>
-          <w:pPr>
-            <w:pStyle w:val="TOC3"/>
-            <w:tabs>
-              <w:tab w:val="right" w:pos="9638" w:leader="dot"/>
-            </w:tabs>
-          </w:pPr>
-          <w:hyperlink w:history="1" w:anchor="_Toc49">
-            <w:r>
-              <w:t xml:space="preserve">Quando qualcosa va storto</w:t>
-            </w:r>
-            <w:r>
-              <w:tab/>
-            </w:r>
-            <w:r>
-              <w:fldChar w:fldCharType="begin" w:dirty="true"/>
-              <w:instrText xml:space="preserve">PAGEREF _Toc49 \h</w:instrText>
-              <w:fldChar w:fldCharType="separate"/>
-              <w:fldChar w:fldCharType="end"/>
-            </w:r>
-          </w:hyperlink>
-        </w:p>
-        <w:p>
-          <w:pPr>
-            <w:pStyle w:val="TOC3"/>
-            <w:tabs>
-              <w:tab w:val="right" w:pos="9638" w:leader="dot"/>
-            </w:tabs>
-          </w:pPr>
-          <w:hyperlink w:history="1" w:anchor="_Toc50">
-            <w:r>
-              <w:t xml:space="preserve">Le scelte</w:t>
-            </w:r>
-            <w:r>
-              <w:tab/>
-            </w:r>
-            <w:r>
-              <w:fldChar w:fldCharType="begin" w:dirty="true"/>
-              <w:instrText xml:space="preserve">PAGEREF _Toc50 \h</w:instrText>
+              <w:instrText xml:space="preserve">PAGEREF _Toc27 \h</w:instrText>
               <w:fldChar w:fldCharType="separate"/>
               <w:fldChar w:fldCharType="end"/>
             </w:r>
@@ -1242,456 +736,16 @@
               <w:tab w:val="right" w:pos="9638" w:leader="dot"/>
             </w:tabs>
           </w:pPr>
-          <w:hyperlink w:history="1" w:anchor="_Toc51">
-            <w:r>
-              <w:t xml:space="preserve">3.5 Le notifiche email e la dead-letter queue</w:t>
+          <w:hyperlink w:history="1" w:anchor="_Toc28">
+            <w:r>
+              <w:t xml:space="preserve">A.3 Testo integrale dei JSON</w:t>
             </w:r>
             <w:r>
               <w:tab/>
             </w:r>
             <w:r>
               <w:fldChar w:fldCharType="begin" w:dirty="true"/>
-              <w:instrText xml:space="preserve">PAGEREF _Toc51 \h</w:instrText>
-              <w:fldChar w:fldCharType="separate"/>
-              <w:fldChar w:fldCharType="end"/>
-            </w:r>
-          </w:hyperlink>
-        </w:p>
-        <w:p>
-          <w:pPr>
-            <w:pStyle w:val="TOC3"/>
-            <w:tabs>
-              <w:tab w:val="right" w:pos="9638" w:leader="dot"/>
-            </w:tabs>
-          </w:pPr>
-          <w:hyperlink w:history="1" w:anchor="_Toc52">
-            <w:r>
-              <w:t xml:space="preserve">Il percorso</w:t>
-            </w:r>
-            <w:r>
-              <w:tab/>
-            </w:r>
-            <w:r>
-              <w:fldChar w:fldCharType="begin" w:dirty="true"/>
-              <w:instrText xml:space="preserve">PAGEREF _Toc52 \h</w:instrText>
-              <w:fldChar w:fldCharType="separate"/>
-              <w:fldChar w:fldCharType="end"/>
-            </w:r>
-          </w:hyperlink>
-        </w:p>
-        <w:p>
-          <w:pPr>
-            <w:pStyle w:val="TOC3"/>
-            <w:tabs>
-              <w:tab w:val="right" w:pos="9638" w:leader="dot"/>
-            </w:tabs>
-          </w:pPr>
-          <w:hyperlink w:history="1" w:anchor="_Toc53">
-            <w:r>
-              <w:t xml:space="preserve">Chi parla con chi</w:t>
-            </w:r>
-            <w:r>
-              <w:tab/>
-            </w:r>
-            <w:r>
-              <w:fldChar w:fldCharType="begin" w:dirty="true"/>
-              <w:instrText xml:space="preserve">PAGEREF _Toc53 \h</w:instrText>
-              <w:fldChar w:fldCharType="separate"/>
-              <w:fldChar w:fldCharType="end"/>
-            </w:r>
-          </w:hyperlink>
-        </w:p>
-        <w:p>
-          <w:pPr>
-            <w:pStyle w:val="TOC3"/>
-            <w:tabs>
-              <w:tab w:val="right" w:pos="9638" w:leader="dot"/>
-            </w:tabs>
-          </w:pPr>
-          <w:hyperlink w:history="1" w:anchor="_Toc54">
-            <w:r>
-              <w:t xml:space="preserve">Le autorizzazioni</w:t>
-            </w:r>
-            <w:r>
-              <w:tab/>
-            </w:r>
-            <w:r>
-              <w:fldChar w:fldCharType="begin" w:dirty="true"/>
-              <w:instrText xml:space="preserve">PAGEREF _Toc54 \h</w:instrText>
-              <w:fldChar w:fldCharType="separate"/>
-              <w:fldChar w:fldCharType="end"/>
-            </w:r>
-          </w:hyperlink>
-        </w:p>
-        <w:p>
-          <w:pPr>
-            <w:pStyle w:val="TOC3"/>
-            <w:tabs>
-              <w:tab w:val="right" w:pos="9638" w:leader="dot"/>
-            </w:tabs>
-          </w:pPr>
-          <w:hyperlink w:history="1" w:anchor="_Toc55">
-            <w:r>
-              <w:t xml:space="preserve">Quando qualcosa va storto: la dead-letter queue</w:t>
-            </w:r>
-            <w:r>
-              <w:tab/>
-            </w:r>
-            <w:r>
-              <w:fldChar w:fldCharType="begin" w:dirty="true"/>
-              <w:instrText xml:space="preserve">PAGEREF _Toc55 \h</w:instrText>
-              <w:fldChar w:fldCharType="separate"/>
-              <w:fldChar w:fldCharType="end"/>
-            </w:r>
-          </w:hyperlink>
-        </w:p>
-        <w:p>
-          <w:pPr>
-            <w:pStyle w:val="TOC3"/>
-            <w:tabs>
-              <w:tab w:val="right" w:pos="9638" w:leader="dot"/>
-            </w:tabs>
-          </w:pPr>
-          <w:hyperlink w:history="1" w:anchor="_Toc56">
-            <w:r>
-              <w:t xml:space="preserve">L'allarme e cosa fa il team</w:t>
-            </w:r>
-            <w:r>
-              <w:tab/>
-            </w:r>
-            <w:r>
-              <w:fldChar w:fldCharType="begin" w:dirty="true"/>
-              <w:instrText xml:space="preserve">PAGEREF _Toc56 \h</w:instrText>
-              <w:fldChar w:fldCharType="separate"/>
-              <w:fldChar w:fldCharType="end"/>
-            </w:r>
-          </w:hyperlink>
-        </w:p>
-        <w:p>
-          <w:pPr>
-            <w:pStyle w:val="TOC3"/>
-            <w:tabs>
-              <w:tab w:val="right" w:pos="9638" w:leader="dot"/>
-            </w:tabs>
-          </w:pPr>
-          <w:hyperlink w:history="1" w:anchor="_Toc57">
-            <w:r>
-              <w:t xml:space="preserve">Le scelte</w:t>
-            </w:r>
-            <w:r>
-              <w:tab/>
-            </w:r>
-            <w:r>
-              <w:fldChar w:fldCharType="begin" w:dirty="true"/>
-              <w:instrText xml:space="preserve">PAGEREF _Toc57 \h</w:instrText>
-              <w:fldChar w:fldCharType="separate"/>
-              <w:fldChar w:fldCharType="end"/>
-            </w:r>
-          </w:hyperlink>
-        </w:p>
-        <w:p>
-          <w:pPr>
-            <w:pStyle w:val="TOC2"/>
-            <w:tabs>
-              <w:tab w:val="right" w:pos="9638" w:leader="dot"/>
-            </w:tabs>
-          </w:pPr>
-          <w:hyperlink w:history="1" w:anchor="_Toc58">
-            <w:r>
-              <w:t xml:space="preserve">3.6 Gestione e cancellazione dell'account</w:t>
-            </w:r>
-            <w:r>
-              <w:tab/>
-            </w:r>
-            <w:r>
-              <w:fldChar w:fldCharType="begin" w:dirty="true"/>
-              <w:instrText xml:space="preserve">PAGEREF _Toc58 \h</w:instrText>
-              <w:fldChar w:fldCharType="separate"/>
-              <w:fldChar w:fldCharType="end"/>
-            </w:r>
-          </w:hyperlink>
-        </w:p>
-        <w:p>
-          <w:pPr>
-            <w:pStyle w:val="TOC3"/>
-            <w:tabs>
-              <w:tab w:val="right" w:pos="9638" w:leader="dot"/>
-            </w:tabs>
-          </w:pPr>
-          <w:hyperlink w:history="1" w:anchor="_Toc59">
-            <w:r>
-              <w:t xml:space="preserve">Il percorso</w:t>
-            </w:r>
-            <w:r>
-              <w:tab/>
-            </w:r>
-            <w:r>
-              <w:fldChar w:fldCharType="begin" w:dirty="true"/>
-              <w:instrText xml:space="preserve">PAGEREF _Toc59 \h</w:instrText>
-              <w:fldChar w:fldCharType="separate"/>
-              <w:fldChar w:fldCharType="end"/>
-            </w:r>
-          </w:hyperlink>
-        </w:p>
-        <w:p>
-          <w:pPr>
-            <w:pStyle w:val="TOC3"/>
-            <w:tabs>
-              <w:tab w:val="right" w:pos="9638" w:leader="dot"/>
-            </w:tabs>
-          </w:pPr>
-          <w:hyperlink w:history="1" w:anchor="_Toc60">
-            <w:r>
-              <w:t xml:space="preserve">Chi parla con chi</w:t>
-            </w:r>
-            <w:r>
-              <w:tab/>
-            </w:r>
-            <w:r>
-              <w:fldChar w:fldCharType="begin" w:dirty="true"/>
-              <w:instrText xml:space="preserve">PAGEREF _Toc60 \h</w:instrText>
-              <w:fldChar w:fldCharType="separate"/>
-              <w:fldChar w:fldCharType="end"/>
-            </w:r>
-          </w:hyperlink>
-        </w:p>
-        <w:p>
-          <w:pPr>
-            <w:pStyle w:val="TOC3"/>
-            <w:tabs>
-              <w:tab w:val="right" w:pos="9638" w:leader="dot"/>
-            </w:tabs>
-          </w:pPr>
-          <w:hyperlink w:history="1" w:anchor="_Toc61">
-            <w:r>
-              <w:t xml:space="preserve">Le autorizzazioni chiave</w:t>
-            </w:r>
-            <w:r>
-              <w:tab/>
-            </w:r>
-            <w:r>
-              <w:fldChar w:fldCharType="begin" w:dirty="true"/>
-              <w:instrText xml:space="preserve">PAGEREF _Toc61 \h</w:instrText>
-              <w:fldChar w:fldCharType="separate"/>
-              <w:fldChar w:fldCharType="end"/>
-            </w:r>
-          </w:hyperlink>
-        </w:p>
-        <w:p>
-          <w:pPr>
-            <w:pStyle w:val="TOC3"/>
-            <w:tabs>
-              <w:tab w:val="right" w:pos="9638" w:leader="dot"/>
-            </w:tabs>
-          </w:pPr>
-          <w:hyperlink w:history="1" w:anchor="_Toc62">
-            <w:r>
-              <w:t xml:space="preserve">L'ordine e l'anonimizzazione</w:t>
-            </w:r>
-            <w:r>
-              <w:tab/>
-            </w:r>
-            <w:r>
-              <w:fldChar w:fldCharType="begin" w:dirty="true"/>
-              <w:instrText xml:space="preserve">PAGEREF _Toc62 \h</w:instrText>
-              <w:fldChar w:fldCharType="separate"/>
-              <w:fldChar w:fldCharType="end"/>
-            </w:r>
-          </w:hyperlink>
-        </w:p>
-        <w:p>
-          <w:pPr>
-            <w:pStyle w:val="TOC3"/>
-            <w:tabs>
-              <w:tab w:val="right" w:pos="9638" w:leader="dot"/>
-            </w:tabs>
-          </w:pPr>
-          <w:hyperlink w:history="1" w:anchor="_Toc63">
-            <w:r>
-              <w:t xml:space="preserve">Quando qualcosa va storto</w:t>
-            </w:r>
-            <w:r>
-              <w:tab/>
-            </w:r>
-            <w:r>
-              <w:fldChar w:fldCharType="begin" w:dirty="true"/>
-              <w:instrText xml:space="preserve">PAGEREF _Toc63 \h</w:instrText>
-              <w:fldChar w:fldCharType="separate"/>
-              <w:fldChar w:fldCharType="end"/>
-            </w:r>
-          </w:hyperlink>
-        </w:p>
-        <w:p>
-          <w:pPr>
-            <w:pStyle w:val="TOC3"/>
-            <w:tabs>
-              <w:tab w:val="right" w:pos="9638" w:leader="dot"/>
-            </w:tabs>
-          </w:pPr>
-          <w:hyperlink w:history="1" w:anchor="_Toc64">
-            <w:r>
-              <w:t xml:space="preserve">Le scelte</w:t>
-            </w:r>
-            <w:r>
-              <w:tab/>
-            </w:r>
-            <w:r>
-              <w:fldChar w:fldCharType="begin" w:dirty="true"/>
-              <w:instrText xml:space="preserve">PAGEREF _Toc64 \h</w:instrText>
-              <w:fldChar w:fldCharType="separate"/>
-              <w:fldChar w:fldCharType="end"/>
-            </w:r>
-          </w:hyperlink>
-        </w:p>
-        <w:p>
-          <w:pPr>
-            <w:pStyle w:val="TOC2"/>
-            <w:tabs>
-              <w:tab w:val="right" w:pos="9638" w:leader="dot"/>
-            </w:tabs>
-          </w:pPr>
-          <w:hyperlink w:history="1" w:anchor="_Toc65">
-            <w:r>
-              <w:t xml:space="preserve">3.7 Log, metriche e allarmi</w:t>
-            </w:r>
-            <w:r>
-              <w:tab/>
-            </w:r>
-            <w:r>
-              <w:fldChar w:fldCharType="begin" w:dirty="true"/>
-              <w:instrText xml:space="preserve">PAGEREF _Toc65 \h</w:instrText>
-              <w:fldChar w:fldCharType="separate"/>
-              <w:fldChar w:fldCharType="end"/>
-            </w:r>
-          </w:hyperlink>
-        </w:p>
-        <w:p>
-          <w:pPr>
-            <w:pStyle w:val="TOC3"/>
-            <w:tabs>
-              <w:tab w:val="right" w:pos="9638" w:leader="dot"/>
-            </w:tabs>
-          </w:pPr>
-          <w:hyperlink w:history="1" w:anchor="_Toc66">
-            <w:r>
-              <w:t xml:space="preserve">Il percorso</w:t>
-            </w:r>
-            <w:r>
-              <w:tab/>
-            </w:r>
-            <w:r>
-              <w:fldChar w:fldCharType="begin" w:dirty="true"/>
-              <w:instrText xml:space="preserve">PAGEREF _Toc66 \h</w:instrText>
-              <w:fldChar w:fldCharType="separate"/>
-              <w:fldChar w:fldCharType="end"/>
-            </w:r>
-          </w:hyperlink>
-        </w:p>
-        <w:p>
-          <w:pPr>
-            <w:pStyle w:val="TOC3"/>
-            <w:tabs>
-              <w:tab w:val="right" w:pos="9638" w:leader="dot"/>
-            </w:tabs>
-          </w:pPr>
-          <w:hyperlink w:history="1" w:anchor="_Toc67">
-            <w:r>
-              <w:t xml:space="preserve">Chi parla con chi</w:t>
-            </w:r>
-            <w:r>
-              <w:tab/>
-            </w:r>
-            <w:r>
-              <w:fldChar w:fldCharType="begin" w:dirty="true"/>
-              <w:instrText xml:space="preserve">PAGEREF _Toc67 \h</w:instrText>
-              <w:fldChar w:fldCharType="separate"/>
-              <w:fldChar w:fldCharType="end"/>
-            </w:r>
-          </w:hyperlink>
-        </w:p>
-        <w:p>
-          <w:pPr>
-            <w:pStyle w:val="TOC3"/>
-            <w:tabs>
-              <w:tab w:val="right" w:pos="9638" w:leader="dot"/>
-            </w:tabs>
-          </w:pPr>
-          <w:hyperlink w:history="1" w:anchor="_Toc68">
-            <w:r>
-              <w:t xml:space="preserve">Le autorizzazioni chiave</w:t>
-            </w:r>
-            <w:r>
-              <w:tab/>
-            </w:r>
-            <w:r>
-              <w:fldChar w:fldCharType="begin" w:dirty="true"/>
-              <w:instrText xml:space="preserve">PAGEREF _Toc68 \h</w:instrText>
-              <w:fldChar w:fldCharType="separate"/>
-              <w:fldChar w:fldCharType="end"/>
-            </w:r>
-          </w:hyperlink>
-        </w:p>
-        <w:p>
-          <w:pPr>
-            <w:pStyle w:val="TOC3"/>
-            <w:tabs>
-              <w:tab w:val="right" w:pos="9638" w:leader="dot"/>
-            </w:tabs>
-          </w:pPr>
-          <w:hyperlink w:history="1" w:anchor="_Toc69">
-            <w:r>
-              <w:t xml:space="preserve">Gli allarmi</w:t>
-            </w:r>
-            <w:r>
-              <w:tab/>
-            </w:r>
-            <w:r>
-              <w:fldChar w:fldCharType="begin" w:dirty="true"/>
-              <w:instrText xml:space="preserve">PAGEREF _Toc69 \h</w:instrText>
-              <w:fldChar w:fldCharType="separate"/>
-              <w:fldChar w:fldCharType="end"/>
-            </w:r>
-          </w:hyperlink>
-        </w:p>
-        <w:p>
-          <w:pPr>
-            <w:pStyle w:val="TOC3"/>
-            <w:tabs>
-              <w:tab w:val="right" w:pos="9638" w:leader="dot"/>
-            </w:tabs>
-          </w:pPr>
-          <w:hyperlink w:history="1" w:anchor="_Toc70">
-            <w:r>
-              <w:t xml:space="preserve">Quando qualcosa va storto</w:t>
-            </w:r>
-            <w:r>
-              <w:tab/>
-            </w:r>
-            <w:r>
-              <w:fldChar w:fldCharType="begin" w:dirty="true"/>
-              <w:instrText xml:space="preserve">PAGEREF _Toc70 \h</w:instrText>
-              <w:fldChar w:fldCharType="separate"/>
-              <w:fldChar w:fldCharType="end"/>
-            </w:r>
-          </w:hyperlink>
-        </w:p>
-        <w:p>
-          <w:pPr>
-            <w:pStyle w:val="TOC3"/>
-            <w:tabs>
-              <w:tab w:val="right" w:pos="9638" w:leader="dot"/>
-            </w:tabs>
-          </w:pPr>
-          <w:hyperlink w:history="1" w:anchor="_Toc71">
-            <w:r>
-              <w:t xml:space="preserve">Le scelte</w:t>
-            </w:r>
-            <w:r>
-              <w:tab/>
-            </w:r>
-            <w:r>
-              <w:fldChar w:fldCharType="begin" w:dirty="true"/>
-              <w:instrText xml:space="preserve">PAGEREF _Toc71 \h</w:instrText>
+              <w:instrText xml:space="preserve">PAGEREF _Toc28 \h</w:instrText>
               <w:fldChar w:fldCharType="separate"/>
               <w:fldChar w:fldCharType="end"/>
             </w:r>
@@ -1704,786 +758,16 @@
               <w:tab w:val="right" w:pos="9638" w:leader="dot"/>
             </w:tabs>
           </w:pPr>
-          <w:hyperlink w:history="1" w:anchor="_Toc72">
-            <w:r>
-              <w:t xml:space="preserve">4. Sicurezza e IAM</w:t>
+          <w:hyperlink w:history="1" w:anchor="_Toc29">
+            <w:r>
+              <w:t xml:space="preserve">Appendice B — Configurazioni</w:t>
             </w:r>
             <w:r>
               <w:tab/>
             </w:r>
             <w:r>
               <w:fldChar w:fldCharType="begin" w:dirty="true"/>
-              <w:instrText xml:space="preserve">PAGEREF _Toc72 \h</w:instrText>
-              <w:fldChar w:fldCharType="separate"/>
-              <w:fldChar w:fldCharType="end"/>
-            </w:r>
-          </w:hyperlink>
-        </w:p>
-        <w:p>
-          <w:pPr>
-            <w:pStyle w:val="TOC2"/>
-            <w:tabs>
-              <w:tab w:val="right" w:pos="9638" w:leader="dot"/>
-            </w:tabs>
-          </w:pPr>
-          <w:hyperlink w:history="1" w:anchor="_Toc73">
-            <w:r>
-              <w:t xml:space="preserve">4.1 Le tre facce di IAM</w:t>
-            </w:r>
-            <w:r>
-              <w:tab/>
-            </w:r>
-            <w:r>
-              <w:fldChar w:fldCharType="begin" w:dirty="true"/>
-              <w:instrText xml:space="preserve">PAGEREF _Toc73 \h</w:instrText>
-              <w:fldChar w:fldCharType="separate"/>
-              <w:fldChar w:fldCharType="end"/>
-            </w:r>
-          </w:hyperlink>
-        </w:p>
-        <w:p>
-          <w:pPr>
-            <w:pStyle w:val="TOC3"/>
-            <w:tabs>
-              <w:tab w:val="right" w:pos="9638" w:leader="dot"/>
-            </w:tabs>
-          </w:pPr>
-          <w:hyperlink w:history="1" w:anchor="_Toc74">
-            <w:r>
-              <w:t xml:space="preserve">Come si valuta una richiesta</w:t>
-            </w:r>
-            <w:r>
-              <w:tab/>
-            </w:r>
-            <w:r>
-              <w:fldChar w:fldCharType="begin" w:dirty="true"/>
-              <w:instrText xml:space="preserve">PAGEREF _Toc74 \h</w:instrText>
-              <w:fldChar w:fldCharType="separate"/>
-              <w:fldChar w:fldCharType="end"/>
-            </w:r>
-          </w:hyperlink>
-        </w:p>
-        <w:p>
-          <w:pPr>
-            <w:pStyle w:val="TOC3"/>
-            <w:tabs>
-              <w:tab w:val="right" w:pos="9638" w:leader="dot"/>
-            </w:tabs>
-          </w:pPr>
-          <w:hyperlink w:history="1" w:anchor="_Toc75">
-            <w:r>
-              <w:t xml:space="preserve">Confused deputy</w:t>
-            </w:r>
-            <w:r>
-              <w:tab/>
-            </w:r>
-            <w:r>
-              <w:fldChar w:fldCharType="begin" w:dirty="true"/>
-              <w:instrText xml:space="preserve">PAGEREF _Toc75 \h</w:instrText>
-              <w:fldChar w:fldCharType="separate"/>
-              <w:fldChar w:fldCharType="end"/>
-            </w:r>
-          </w:hyperlink>
-        </w:p>
-        <w:p>
-          <w:pPr>
-            <w:pStyle w:val="TOC3"/>
-            <w:tabs>
-              <w:tab w:val="right" w:pos="9638" w:leader="dot"/>
-            </w:tabs>
-          </w:pPr>
-          <w:hyperlink w:history="1" w:anchor="_Toc76">
-            <w:r>
-              <w:t xml:space="preserve">Privilegio minimo e iam:PassRole</w:t>
-            </w:r>
-            <w:r>
-              <w:tab/>
-            </w:r>
-            <w:r>
-              <w:fldChar w:fldCharType="begin" w:dirty="true"/>
-              <w:instrText xml:space="preserve">PAGEREF _Toc76 \h</w:instrText>
-              <w:fldChar w:fldCharType="separate"/>
-              <w:fldChar w:fldCharType="end"/>
-            </w:r>
-          </w:hyperlink>
-        </w:p>
-        <w:p>
-          <w:pPr>
-            <w:pStyle w:val="TOC2"/>
-            <w:tabs>
-              <w:tab w:val="right" w:pos="9638" w:leader="dot"/>
-            </w:tabs>
-          </w:pPr>
-          <w:hyperlink w:history="1" w:anchor="_Toc77">
-            <w:r>
-              <w:t xml:space="preserve">4.2 La rete come secondo livello</w:t>
-            </w:r>
-            <w:r>
-              <w:tab/>
-            </w:r>
-            <w:r>
-              <w:fldChar w:fldCharType="begin" w:dirty="true"/>
-              <w:instrText xml:space="preserve">PAGEREF _Toc77 \h</w:instrText>
-              <w:fldChar w:fldCharType="separate"/>
-              <w:fldChar w:fldCharType="end"/>
-            </w:r>
-          </w:hyperlink>
-        </w:p>
-        <w:p>
-          <w:pPr>
-            <w:pStyle w:val="TOC2"/>
-            <w:tabs>
-              <w:tab w:val="right" w:pos="9638" w:leader="dot"/>
-            </w:tabs>
-          </w:pPr>
-          <w:hyperlink w:history="1" w:anchor="_Toc78">
-            <w:r>
-              <w:t xml:space="preserve">4.3 La mappa delle autorizzazioni</w:t>
-            </w:r>
-            <w:r>
-              <w:tab/>
-            </w:r>
-            <w:r>
-              <w:fldChar w:fldCharType="begin" w:dirty="true"/>
-              <w:instrText xml:space="preserve">PAGEREF _Toc78 \h</w:instrText>
-              <w:fldChar w:fldCharType="separate"/>
-              <w:fldChar w:fldCharType="end"/>
-            </w:r>
-          </w:hyperlink>
-        </w:p>
-        <w:p>
-          <w:pPr>
-            <w:pStyle w:val="TOC1"/>
-            <w:tabs>
-              <w:tab w:val="right" w:pos="9638" w:leader="dot"/>
-            </w:tabs>
-          </w:pPr>
-          <w:hyperlink w:history="1" w:anchor="_Toc79">
-            <w:r>
-              <w:t xml:space="preserve">5. Decisioni, alternative e limiti</w:t>
-            </w:r>
-            <w:r>
-              <w:tab/>
-            </w:r>
-            <w:r>
-              <w:fldChar w:fldCharType="begin" w:dirty="true"/>
-              <w:instrText xml:space="preserve">PAGEREF _Toc79 \h</w:instrText>
-              <w:fldChar w:fldCharType="separate"/>
-              <w:fldChar w:fldCharType="end"/>
-            </w:r>
-          </w:hyperlink>
-        </w:p>
-        <w:p>
-          <w:pPr>
-            <w:pStyle w:val="TOC2"/>
-            <w:tabs>
-              <w:tab w:val="right" w:pos="9638" w:leader="dot"/>
-            </w:tabs>
-          </w:pPr>
-          <w:hyperlink w:history="1" w:anchor="_Toc80">
-            <w:r>
-              <w:t xml:space="preserve">5.1 Le decisioni principali</w:t>
-            </w:r>
-            <w:r>
-              <w:tab/>
-            </w:r>
-            <w:r>
-              <w:fldChar w:fldCharType="begin" w:dirty="true"/>
-              <w:instrText xml:space="preserve">PAGEREF _Toc80 \h</w:instrText>
-              <w:fldChar w:fldCharType="separate"/>
-              <w:fldChar w:fldCharType="end"/>
-            </w:r>
-          </w:hyperlink>
-        </w:p>
-        <w:p>
-          <w:pPr>
-            <w:pStyle w:val="TOC2"/>
-            <w:tabs>
-              <w:tab w:val="right" w:pos="9638" w:leader="dot"/>
-            </w:tabs>
-          </w:pPr>
-          <w:hyperlink w:history="1" w:anchor="_Toc81">
-            <w:r>
-              <w:t xml:space="preserve">5.2 Limiti e rischi dichiarati</w:t>
-            </w:r>
-            <w:r>
-              <w:tab/>
-            </w:r>
-            <w:r>
-              <w:fldChar w:fldCharType="begin" w:dirty="true"/>
-              <w:instrText xml:space="preserve">PAGEREF _Toc81 \h</w:instrText>
-              <w:fldChar w:fldCharType="separate"/>
-              <w:fldChar w:fldCharType="end"/>
-            </w:r>
-          </w:hyperlink>
-        </w:p>
-        <w:p>
-          <w:pPr>
-            <w:pStyle w:val="TOC2"/>
-            <w:tabs>
-              <w:tab w:val="right" w:pos="9638" w:leader="dot"/>
-            </w:tabs>
-          </w:pPr>
-          <w:hyperlink w:history="1" w:anchor="_Toc82">
-            <w:r>
-              <w:t xml:space="preserve">5.3 Sviluppi possibili</w:t>
-            </w:r>
-            <w:r>
-              <w:tab/>
-            </w:r>
-            <w:r>
-              <w:fldChar w:fldCharType="begin" w:dirty="true"/>
-              <w:instrText xml:space="preserve">PAGEREF _Toc82 \h</w:instrText>
-              <w:fldChar w:fldCharType="separate"/>
-              <w:fldChar w:fldCharType="end"/>
-            </w:r>
-          </w:hyperlink>
-        </w:p>
-        <w:p>
-          <w:pPr>
-            <w:pStyle w:val="TOC1"/>
-            <w:tabs>
-              <w:tab w:val="right" w:pos="9638" w:leader="dot"/>
-            </w:tabs>
-          </w:pPr>
-          <w:hyperlink w:history="1" w:anchor="_Toc83">
-            <w:r>
-              <w:t xml:space="preserve">Appendice A — Ruoli e policy</w:t>
-            </w:r>
-            <w:r>
-              <w:tab/>
-            </w:r>
-            <w:r>
-              <w:fldChar w:fldCharType="begin" w:dirty="true"/>
-              <w:instrText xml:space="preserve">PAGEREF _Toc83 \h</w:instrText>
-              <w:fldChar w:fldCharType="separate"/>
-              <w:fldChar w:fldCharType="end"/>
-            </w:r>
-          </w:hyperlink>
-        </w:p>
-        <w:p>
-          <w:pPr>
-            <w:pStyle w:val="TOC2"/>
-            <w:tabs>
-              <w:tab w:val="right" w:pos="9638" w:leader="dot"/>
-            </w:tabs>
-          </w:pPr>
-          <w:hyperlink w:history="1" w:anchor="_Toc84">
-            <w:r>
-              <w:t xml:space="preserve">A.1 I ruoli</w:t>
-            </w:r>
-            <w:r>
-              <w:tab/>
-            </w:r>
-            <w:r>
-              <w:fldChar w:fldCharType="begin" w:dirty="true"/>
-              <w:instrText xml:space="preserve">PAGEREF _Toc84 \h</w:instrText>
-              <w:fldChar w:fldCharType="separate"/>
-              <w:fldChar w:fldCharType="end"/>
-            </w:r>
-          </w:hyperlink>
-        </w:p>
-        <w:p>
-          <w:pPr>
-            <w:pStyle w:val="TOC2"/>
-            <w:tabs>
-              <w:tab w:val="right" w:pos="9638" w:leader="dot"/>
-            </w:tabs>
-          </w:pPr>
-          <w:hyperlink w:history="1" w:anchor="_Toc85">
-            <w:r>
-              <w:t xml:space="preserve">A.2 Le resource policy</w:t>
-            </w:r>
-            <w:r>
-              <w:tab/>
-            </w:r>
-            <w:r>
-              <w:fldChar w:fldCharType="begin" w:dirty="true"/>
-              <w:instrText xml:space="preserve">PAGEREF _Toc85 \h</w:instrText>
-              <w:fldChar w:fldCharType="separate"/>
-              <w:fldChar w:fldCharType="end"/>
-            </w:r>
-          </w:hyperlink>
-        </w:p>
-        <w:p>
-          <w:pPr>
-            <w:pStyle w:val="TOC2"/>
-            <w:tabs>
-              <w:tab w:val="right" w:pos="9638" w:leader="dot"/>
-            </w:tabs>
-          </w:pPr>
-          <w:hyperlink w:history="1" w:anchor="_Toc86">
-            <w:r>
-              <w:t xml:space="preserve">A.3 Testo integrale dei JSON</w:t>
-            </w:r>
-            <w:r>
-              <w:tab/>
-            </w:r>
-            <w:r>
-              <w:fldChar w:fldCharType="begin" w:dirty="true"/>
-              <w:instrText xml:space="preserve">PAGEREF _Toc86 \h</w:instrText>
-              <w:fldChar w:fldCharType="separate"/>
-              <w:fldChar w:fldCharType="end"/>
-            </w:r>
-          </w:hyperlink>
-        </w:p>
-        <w:p>
-          <w:pPr>
-            <w:pStyle w:val="TOC3"/>
-            <w:tabs>
-              <w:tab w:val="right" w:pos="9638" w:leader="dot"/>
-            </w:tabs>
-          </w:pPr>
-          <w:hyperlink w:history="1" w:anchor="_Toc87">
-            <w:r>
-              <w:t xml:space="preserve">Trust relationship</w:t>
-            </w:r>
-            <w:r>
-              <w:tab/>
-            </w:r>
-            <w:r>
-              <w:fldChar w:fldCharType="begin" w:dirty="true"/>
-              <w:instrText xml:space="preserve">PAGEREF _Toc87 \h</w:instrText>
-              <w:fldChar w:fldCharType="separate"/>
-              <w:fldChar w:fldCharType="end"/>
-            </w:r>
-          </w:hyperlink>
-        </w:p>
-        <w:p>
-          <w:pPr>
-            <w:pStyle w:val="TOC3"/>
-            <w:tabs>
-              <w:tab w:val="right" w:pos="9638" w:leader="dot"/>
-            </w:tabs>
-          </w:pPr>
-          <w:hyperlink w:history="1" w:anchor="_Toc88">
-            <w:r>
-              <w:t xml:space="preserve">Identity policy dei ruoli delle Lambda</w:t>
-            </w:r>
-            <w:r>
-              <w:tab/>
-            </w:r>
-            <w:r>
-              <w:fldChar w:fldCharType="begin" w:dirty="true"/>
-              <w:instrText xml:space="preserve">PAGEREF _Toc88 \h</w:instrText>
-              <w:fldChar w:fldCharType="separate"/>
-              <w:fldChar w:fldCharType="end"/>
-            </w:r>
-          </w:hyperlink>
-        </w:p>
-        <w:p>
-          <w:pPr>
-            <w:pStyle w:val="TOC3"/>
-            <w:tabs>
-              <w:tab w:val="right" w:pos="9638" w:leader="dot"/>
-            </w:tabs>
-          </w:pPr>
-          <w:hyperlink w:history="1" w:anchor="_Toc89">
-            <w:r>
-              <w:t xml:space="preserve">Identity policy del ruolo del proxy</w:t>
-            </w:r>
-            <w:r>
-              <w:tab/>
-            </w:r>
-            <w:r>
-              <w:fldChar w:fldCharType="begin" w:dirty="true"/>
-              <w:instrText xml:space="preserve">PAGEREF _Toc89 \h</w:instrText>
-              <w:fldChar w:fldCharType="separate"/>
-              <w:fldChar w:fldCharType="end"/>
-            </w:r>
-          </w:hyperlink>
-        </w:p>
-        <w:p>
-          <w:pPr>
-            <w:pStyle w:val="TOC3"/>
-            <w:tabs>
-              <w:tab w:val="right" w:pos="9638" w:leader="dot"/>
-            </w:tabs>
-          </w:pPr>
-          <w:hyperlink w:history="1" w:anchor="_Toc90">
-            <w:r>
-              <w:t xml:space="preserve">Policy per le persone del team</w:t>
-            </w:r>
-            <w:r>
-              <w:tab/>
-            </w:r>
-            <w:r>
-              <w:fldChar w:fldCharType="begin" w:dirty="true"/>
-              <w:instrText xml:space="preserve">PAGEREF _Toc90 \h</w:instrText>
-              <w:fldChar w:fldCharType="separate"/>
-              <w:fldChar w:fldCharType="end"/>
-            </w:r>
-          </w:hyperlink>
-        </w:p>
-        <w:p>
-          <w:pPr>
-            <w:pStyle w:val="TOC3"/>
-            <w:tabs>
-              <w:tab w:val="right" w:pos="9638" w:leader="dot"/>
-            </w:tabs>
-          </w:pPr>
-          <w:hyperlink w:history="1" w:anchor="_Toc91">
-            <w:r>
-              <w:t xml:space="preserve">Resource policy delle Lambda</w:t>
-            </w:r>
-            <w:r>
-              <w:tab/>
-            </w:r>
-            <w:r>
-              <w:fldChar w:fldCharType="begin" w:dirty="true"/>
-              <w:instrText xml:space="preserve">PAGEREF _Toc91 \h</w:instrText>
-              <w:fldChar w:fldCharType="separate"/>
-              <w:fldChar w:fldCharType="end"/>
-            </w:r>
-          </w:hyperlink>
-        </w:p>
-        <w:p>
-          <w:pPr>
-            <w:pStyle w:val="TOC3"/>
-            <w:tabs>
-              <w:tab w:val="right" w:pos="9638" w:leader="dot"/>
-            </w:tabs>
-          </w:pPr>
-          <w:hyperlink w:history="1" w:anchor="_Toc92">
-            <w:r>
-              <w:t xml:space="preserve">Bucket policy</w:t>
-            </w:r>
-            <w:r>
-              <w:tab/>
-            </w:r>
-            <w:r>
-              <w:fldChar w:fldCharType="begin" w:dirty="true"/>
-              <w:instrText xml:space="preserve">PAGEREF _Toc92 \h</w:instrText>
-              <w:fldChar w:fldCharType="separate"/>
-              <w:fldChar w:fldCharType="end"/>
-            </w:r>
-          </w:hyperlink>
-        </w:p>
-        <w:p>
-          <w:pPr>
-            <w:pStyle w:val="TOC3"/>
-            <w:tabs>
-              <w:tab w:val="right" w:pos="9638" w:leader="dot"/>
-            </w:tabs>
-          </w:pPr>
-          <w:hyperlink w:history="1" w:anchor="_Toc93">
-            <w:r>
-              <w:t xml:space="preserve">Queue policy</w:t>
-            </w:r>
-            <w:r>
-              <w:tab/>
-            </w:r>
-            <w:r>
-              <w:fldChar w:fldCharType="begin" w:dirty="true"/>
-              <w:instrText xml:space="preserve">PAGEREF _Toc93 \h</w:instrText>
-              <w:fldChar w:fldCharType="separate"/>
-              <w:fldChar w:fldCharType="end"/>
-            </w:r>
-          </w:hyperlink>
-        </w:p>
-        <w:p>
-          <w:pPr>
-            <w:pStyle w:val="TOC3"/>
-            <w:tabs>
-              <w:tab w:val="right" w:pos="9638" w:leader="dot"/>
-            </w:tabs>
-          </w:pPr>
-          <w:hyperlink w:history="1" w:anchor="_Toc94">
-            <w:r>
-              <w:t xml:space="preserve">Endpoint policy</w:t>
-            </w:r>
-            <w:r>
-              <w:tab/>
-            </w:r>
-            <w:r>
-              <w:fldChar w:fldCharType="begin" w:dirty="true"/>
-              <w:instrText xml:space="preserve">PAGEREF _Toc94 \h</w:instrText>
-              <w:fldChar w:fldCharType="separate"/>
-              <w:fldChar w:fldCharType="end"/>
-            </w:r>
-          </w:hyperlink>
-        </w:p>
-        <w:p>
-          <w:pPr>
-            <w:pStyle w:val="TOC1"/>
-            <w:tabs>
-              <w:tab w:val="right" w:pos="9638" w:leader="dot"/>
-            </w:tabs>
-          </w:pPr>
-          <w:hyperlink w:history="1" w:anchor="_Toc95">
-            <w:r>
-              <w:t xml:space="preserve">Appendice B — Configurazioni</w:t>
-            </w:r>
-            <w:r>
-              <w:tab/>
-            </w:r>
-            <w:r>
-              <w:fldChar w:fldCharType="begin" w:dirty="true"/>
-              <w:instrText xml:space="preserve">PAGEREF _Toc95 \h</w:instrText>
-              <w:fldChar w:fldCharType="separate"/>
-              <w:fldChar w:fldCharType="end"/>
-            </w:r>
-          </w:hyperlink>
-        </w:p>
-        <w:p>
-          <w:pPr>
-            <w:pStyle w:val="TOC3"/>
-            <w:tabs>
-              <w:tab w:val="right" w:pos="9638" w:leader="dot"/>
-            </w:tabs>
-          </w:pPr>
-          <w:hyperlink w:history="1" w:anchor="_Toc96">
-            <w:r>
-              <w:t xml:space="preserve">cognito-user-pool.json</w:t>
-            </w:r>
-            <w:r>
-              <w:tab/>
-            </w:r>
-            <w:r>
-              <w:fldChar w:fldCharType="begin" w:dirty="true"/>
-              <w:instrText xml:space="preserve">PAGEREF _Toc96 \h</w:instrText>
-              <w:fldChar w:fldCharType="separate"/>
-              <w:fldChar w:fldCharType="end"/>
-            </w:r>
-          </w:hyperlink>
-        </w:p>
-        <w:p>
-          <w:pPr>
-            <w:pStyle w:val="TOC3"/>
-            <w:tabs>
-              <w:tab w:val="right" w:pos="9638" w:leader="dot"/>
-            </w:tabs>
-          </w:pPr>
-          <w:hyperlink w:history="1" w:anchor="_Toc97">
-            <w:r>
-              <w:t xml:space="preserve">cognito-app-client.json</w:t>
-            </w:r>
-            <w:r>
-              <w:tab/>
-            </w:r>
-            <w:r>
-              <w:fldChar w:fldCharType="begin" w:dirty="true"/>
-              <w:instrText xml:space="preserve">PAGEREF _Toc97 \h</w:instrText>
-              <w:fldChar w:fldCharType="separate"/>
-              <w:fldChar w:fldCharType="end"/>
-            </w:r>
-          </w:hyperlink>
-        </w:p>
-        <w:p>
-          <w:pPr>
-            <w:pStyle w:val="TOC3"/>
-            <w:tabs>
-              <w:tab w:val="right" w:pos="9638" w:leader="dot"/>
-            </w:tabs>
-          </w:pPr>
-          <w:hyperlink w:history="1" w:anchor="_Toc98">
-            <w:r>
-              <w:t xml:space="preserve">http-api-cors.json</w:t>
-            </w:r>
-            <w:r>
-              <w:tab/>
-            </w:r>
-            <w:r>
-              <w:fldChar w:fldCharType="begin" w:dirty="true"/>
-              <w:instrText xml:space="preserve">PAGEREF _Toc98 \h</w:instrText>
-              <w:fldChar w:fldCharType="separate"/>
-              <w:fldChar w:fldCharType="end"/>
-            </w:r>
-          </w:hyperlink>
-        </w:p>
-        <w:p>
-          <w:pPr>
-            <w:pStyle w:val="TOC3"/>
-            <w:tabs>
-              <w:tab w:val="right" w:pos="9638" w:leader="dot"/>
-            </w:tabs>
-          </w:pPr>
-          <w:hyperlink w:history="1" w:anchor="_Toc99">
-            <w:r>
-              <w:t xml:space="preserve">presigned-post-conditions.json</w:t>
-            </w:r>
-            <w:r>
-              <w:tab/>
-            </w:r>
-            <w:r>
-              <w:fldChar w:fldCharType="begin" w:dirty="true"/>
-              <w:instrText xml:space="preserve">PAGEREF _Toc99 \h</w:instrText>
-              <w:fldChar w:fldCharType="separate"/>
-              <w:fldChar w:fldCharType="end"/>
-            </w:r>
-          </w:hyperlink>
-        </w:p>
-        <w:p>
-          <w:pPr>
-            <w:pStyle w:val="TOC3"/>
-            <w:tabs>
-              <w:tab w:val="right" w:pos="9638" w:leader="dot"/>
-            </w:tabs>
-          </w:pPr>
-          <w:hyperlink w:history="1" w:anchor="_Toc100">
-            <w:r>
-              <w:t xml:space="preserve">s3-files-cors.json</w:t>
-            </w:r>
-            <w:r>
-              <w:tab/>
-            </w:r>
-            <w:r>
-              <w:fldChar w:fldCharType="begin" w:dirty="true"/>
-              <w:instrText xml:space="preserve">PAGEREF _Toc100 \h</w:instrText>
-              <w:fldChar w:fldCharType="separate"/>
-              <w:fldChar w:fldCharType="end"/>
-            </w:r>
-          </w:hyperlink>
-        </w:p>
-        <w:p>
-          <w:pPr>
-            <w:pStyle w:val="TOC3"/>
-            <w:tabs>
-              <w:tab w:val="right" w:pos="9638" w:leader="dot"/>
-            </w:tabs>
-          </w:pPr>
-          <w:hyperlink w:history="1" w:anchor="_Toc101">
-            <w:r>
-              <w:t xml:space="preserve">s3-files-notification.json</w:t>
-            </w:r>
-            <w:r>
-              <w:tab/>
-            </w:r>
-            <w:r>
-              <w:fldChar w:fldCharType="begin" w:dirty="true"/>
-              <w:instrText xml:space="preserve">PAGEREF _Toc101 \h</w:instrText>
-              <w:fldChar w:fldCharType="separate"/>
-              <w:fldChar w:fldCharType="end"/>
-            </w:r>
-          </w:hyperlink>
-        </w:p>
-        <w:p>
-          <w:pPr>
-            <w:pStyle w:val="TOC3"/>
-            <w:tabs>
-              <w:tab w:val="right" w:pos="9638" w:leader="dot"/>
-            </w:tabs>
-          </w:pPr>
-          <w:hyperlink w:history="1" w:anchor="_Toc102">
-            <w:r>
-              <w:t xml:space="preserve">sns-subscription-attributes.json</w:t>
-            </w:r>
-            <w:r>
-              <w:tab/>
-            </w:r>
-            <w:r>
-              <w:fldChar w:fldCharType="begin" w:dirty="true"/>
-              <w:instrText xml:space="preserve">PAGEREF _Toc102 \h</w:instrText>
-              <w:fldChar w:fldCharType="separate"/>
-              <w:fldChar w:fldCharType="end"/>
-            </w:r>
-          </w:hyperlink>
-        </w:p>
-        <w:p>
-          <w:pPr>
-            <w:pStyle w:val="TOC3"/>
-            <w:tabs>
-              <w:tab w:val="right" w:pos="9638" w:leader="dot"/>
-            </w:tabs>
-          </w:pPr>
-          <w:hyperlink w:history="1" w:anchor="_Toc103">
-            <w:r>
-              <w:t xml:space="preserve">sqs-notifications-queue-attributes.json</w:t>
-            </w:r>
-            <w:r>
-              <w:tab/>
-            </w:r>
-            <w:r>
-              <w:fldChar w:fldCharType="begin" w:dirty="true"/>
-              <w:instrText xml:space="preserve">PAGEREF _Toc103 \h</w:instrText>
-              <w:fldChar w:fldCharType="separate"/>
-              <w:fldChar w:fldCharType="end"/>
-            </w:r>
-          </w:hyperlink>
-        </w:p>
-        <w:p>
-          <w:pPr>
-            <w:pStyle w:val="TOC3"/>
-            <w:tabs>
-              <w:tab w:val="right" w:pos="9638" w:leader="dot"/>
-            </w:tabs>
-          </w:pPr>
-          <w:hyperlink w:history="1" w:anchor="_Toc104">
-            <w:r>
-              <w:t xml:space="preserve">sqs-notifications-dlq-attributes.json</w:t>
-            </w:r>
-            <w:r>
-              <w:tab/>
-            </w:r>
-            <w:r>
-              <w:fldChar w:fldCharType="begin" w:dirty="true"/>
-              <w:instrText xml:space="preserve">PAGEREF _Toc104 \h</w:instrText>
-              <w:fldChar w:fldCharType="separate"/>
-              <w:fldChar w:fldCharType="end"/>
-            </w:r>
-          </w:hyperlink>
-        </w:p>
-        <w:p>
-          <w:pPr>
-            <w:pStyle w:val="TOC3"/>
-            <w:tabs>
-              <w:tab w:val="right" w:pos="9638" w:leader="dot"/>
-            </w:tabs>
-          </w:pPr>
-          <w:hyperlink w:history="1" w:anchor="_Toc105">
-            <w:r>
-              <w:t xml:space="preserve">lambda-mailer-event-source-mapping.json</w:t>
-            </w:r>
-            <w:r>
-              <w:tab/>
-            </w:r>
-            <w:r>
-              <w:fldChar w:fldCharType="begin" w:dirty="true"/>
-              <w:instrText xml:space="preserve">PAGEREF _Toc105 \h</w:instrText>
-              <w:fldChar w:fldCharType="separate"/>
-              <w:fldChar w:fldCharType="end"/>
-            </w:r>
-          </w:hyperlink>
-        </w:p>
-        <w:p>
-          <w:pPr>
-            <w:pStyle w:val="TOC3"/>
-            <w:tabs>
-              <w:tab w:val="right" w:pos="9638" w:leader="dot"/>
-            </w:tabs>
-          </w:pPr>
-          <w:hyperlink w:history="1" w:anchor="_Toc106">
-            <w:r>
-              <w:t xml:space="preserve">cloudwatch-alarm-notifications-dlq.json</w:t>
-            </w:r>
-            <w:r>
-              <w:tab/>
-            </w:r>
-            <w:r>
-              <w:fldChar w:fldCharType="begin" w:dirty="true"/>
-              <w:instrText xml:space="preserve">PAGEREF _Toc106 \h</w:instrText>
-              <w:fldChar w:fldCharType="separate"/>
-              <w:fldChar w:fldCharType="end"/>
-            </w:r>
-          </w:hyperlink>
-        </w:p>
-        <w:p>
-          <w:pPr>
-            <w:pStyle w:val="TOC3"/>
-            <w:tabs>
-              <w:tab w:val="right" w:pos="9638" w:leader="dot"/>
-            </w:tabs>
-          </w:pPr>
-          <w:hyperlink w:history="1" w:anchor="_Toc107">
-            <w:r>
-              <w:t xml:space="preserve">cloudwatch-metric-filter-mailer-permanent-failures.json</w:t>
-            </w:r>
-            <w:r>
-              <w:tab/>
-            </w:r>
-            <w:r>
-              <w:fldChar w:fldCharType="begin" w:dirty="true"/>
-              <w:instrText xml:space="preserve">PAGEREF _Toc107 \h</w:instrText>
+              <w:instrText xml:space="preserve">PAGEREF _Toc29 \h</w:instrText>
               <w:fldChar w:fldCharType="separate"/>
               <w:fldChar w:fldCharType="end"/>
             </w:r>
@@ -2505,9 +789,6 @@
           <w:docGrid w:linePitch="360"/>
         </w:sectPr>
       </w:pPr>
-      <w:r>
-        <w:br w:type="page"/>
-      </w:r>
     </w:p>
     <w:p>
       <w:pPr>
@@ -3126,11 +1407,9 @@
       <w:pPr>
         <w:pStyle w:val="Heading3"/>
       </w:pPr>
-      <w:bookmarkStart w:name="_Toc4" w:id="4"/>
       <w:r>
         <w:t xml:space="preserve">Un carico variabile e imprevedibile</w:t>
       </w:r>
-      <w:bookmarkEnd w:id="4"/>
     </w:p>
     <w:p>
       <w:pPr>
@@ -3155,11 +1434,9 @@
       <w:pPr>
         <w:pStyle w:val="Heading3"/>
       </w:pPr>
-      <w:bookmarkStart w:name="_Toc5" w:id="5"/>
       <w:r>
         <w:t xml:space="preserve">File grandi</w:t>
       </w:r>
-      <w:bookmarkEnd w:id="5"/>
     </w:p>
     <w:p>
       <w:pPr>
@@ -3184,11 +1461,9 @@
       <w:pPr>
         <w:pStyle w:val="Heading3"/>
       </w:pPr>
-      <w:bookmarkStart w:name="_Toc6" w:id="6"/>
       <w:r>
         <w:t xml:space="preserve">Dati personali da proteggere</w:t>
       </w:r>
-      <w:bookmarkEnd w:id="6"/>
     </w:p>
     <w:p>
       <w:pPr>
@@ -3213,11 +1488,9 @@
       <w:pPr>
         <w:pStyle w:val="Heading3"/>
       </w:pPr>
-      <w:bookmarkStart w:name="_Toc7" w:id="7"/>
       <w:r>
         <w:t xml:space="preserve">Costi bassi, senza utenti fissi</w:t>
       </w:r>
-      <w:bookmarkEnd w:id="7"/>
     </w:p>
     <w:p>
       <w:pPr>
@@ -3242,11 +1515,9 @@
       <w:pPr>
         <w:pStyle w:val="Heading3"/>
       </w:pPr>
-      <w:bookmarkStart w:name="_Toc8" w:id="8"/>
       <w:r>
         <w:t xml:space="preserve">Nessun server da gestire</w:t>
       </w:r>
-      <w:bookmarkEnd w:id="8"/>
     </w:p>
     <w:p>
       <w:pPr>
@@ -3261,11 +1532,9 @@
       <w:pPr>
         <w:pStyle w:val="Heading3"/>
       </w:pPr>
-      <w:bookmarkStart w:name="_Toc9" w:id="9"/>
       <w:r>
         <w:t xml:space="preserve">Disponibile anche se cade una zona</w:t>
       </w:r>
-      <w:bookmarkEnd w:id="9"/>
     </w:p>
     <w:p>
       <w:pPr>
@@ -3280,11 +1549,11 @@
       <w:pPr>
         <w:pStyle w:val="Heading2"/>
       </w:pPr>
-      <w:bookmarkStart w:name="_Toc10" w:id="10"/>
+      <w:bookmarkStart w:name="_Toc4" w:id="4"/>
       <w:r>
         <w:t xml:space="preserve">1.3 I requisiti</w:t>
       </w:r>
-      <w:bookmarkEnd w:id="10"/>
+      <w:bookmarkEnd w:id="4"/>
     </w:p>
     <w:p>
       <w:pPr>
@@ -3655,21 +1924,21 @@
       <w:pPr>
         <w:pStyle w:val="Heading1"/>
       </w:pPr>
-      <w:bookmarkStart w:name="_Toc11" w:id="11"/>
+      <w:bookmarkStart w:name="_Toc5" w:id="5"/>
       <w:r>
         <w:t xml:space="preserve">2. La soluzione in sintesi</w:t>
       </w:r>
-      <w:bookmarkEnd w:id="11"/>
+      <w:bookmarkEnd w:id="5"/>
     </w:p>
     <w:p>
       <w:pPr>
         <w:pStyle w:val="Heading2"/>
       </w:pPr>
-      <w:bookmarkStart w:name="_Toc12" w:id="12"/>
+      <w:bookmarkStart w:name="_Toc6" w:id="6"/>
       <w:r>
         <w:t xml:space="preserve">2.1 L'idea e il diagramma</w:t>
       </w:r>
-      <w:bookmarkEnd w:id="12"/>
+      <w:bookmarkEnd w:id="6"/>
     </w:p>
     <w:p>
       <w:pPr>
@@ -3719,7 +1988,7 @@
       <w:r>
         <w:drawing>
           <wp:inline distT="0" distB="0" distL="0" distR="0">
-            <wp:extent cx="6124575" cy="5324475"/>
+            <wp:extent cx="5705475" cy="4953000"/>
             <wp:effectExtent t="0" r="0" b="0" l="0"/>
             <wp:docPr id="1" name=""/>
             <wp:cNvGraphicFramePr>
@@ -3744,7 +2013,7 @@
                   <pic:spPr bwMode="auto">
                     <a:xfrm>
                       <a:off x="0" y="0"/>
-                      <a:ext cx="6124575" cy="5324475"/>
+                      <a:ext cx="5705475" cy="4953000"/>
                     </a:xfrm>
                     <a:prstGeom prst="rect">
                       <a:avLst/>
@@ -3846,11 +2115,9 @@
       <w:pPr>
         <w:pStyle w:val="Heading3"/>
       </w:pPr>
-      <w:bookmarkStart w:name="_Toc13" w:id="13"/>
       <w:r>
         <w:t xml:space="preserve">Un esempio: un'offerta</w:t>
       </w:r>
-      <w:bookmarkEnd w:id="13"/>
     </w:p>
     <w:p>
       <w:pPr>
@@ -3889,11 +2156,11 @@
       <w:pPr>
         <w:pStyle w:val="Heading2"/>
       </w:pPr>
-      <w:bookmarkStart w:name="_Toc14" w:id="14"/>
+      <w:bookmarkStart w:name="_Toc7" w:id="7"/>
       <w:r>
         <w:t xml:space="preserve">2.2 Dai requisiti alla soluzione</w:t>
       </w:r>
-      <w:bookmarkEnd w:id="14"/>
+      <w:bookmarkEnd w:id="7"/>
     </w:p>
     <w:p>
       <w:pPr>
@@ -5330,11 +3597,11 @@
       <w:pPr>
         <w:pStyle w:val="Heading2"/>
       </w:pPr>
-      <w:bookmarkStart w:name="_Toc15" w:id="15"/>
+      <w:bookmarkStart w:name="_Toc8" w:id="8"/>
       <w:r>
         <w:t xml:space="preserve">2.3 Le scelte di fondo</w:t>
       </w:r>
-      <w:bookmarkEnd w:id="15"/>
+      <w:bookmarkEnd w:id="8"/>
     </w:p>
     <w:p>
       <w:pPr>
@@ -5349,11 +3616,9 @@
       <w:pPr>
         <w:pStyle w:val="Heading3"/>
       </w:pPr>
-      <w:bookmarkStart w:name="_Toc16" w:id="16"/>
       <w:r>
         <w:t xml:space="preserve">Serverless</w:t>
       </w:r>
-      <w:bookmarkEnd w:id="16"/>
     </w:p>
     <w:p>
       <w:pPr>
@@ -5368,11 +3633,9 @@
       <w:pPr>
         <w:pStyle w:val="Heading3"/>
       </w:pPr>
-      <w:bookmarkStart w:name="_Toc17" w:id="17"/>
       <w:r>
         <w:t xml:space="preserve">Una regione, due zone</w:t>
       </w:r>
-      <w:bookmarkEnd w:id="17"/>
     </w:p>
     <w:p>
       <w:pPr>
@@ -5399,11 +3662,9 @@
       <w:pPr>
         <w:pStyle w:val="Heading3"/>
       </w:pPr>
-      <w:bookmarkStart w:name="_Toc18" w:id="18"/>
       <w:r>
         <w:t xml:space="preserve">Una VPC senza Internet Gateway né NAT</w:t>
       </w:r>
-      <w:bookmarkEnd w:id="18"/>
     </w:p>
     <w:p>
       <w:pPr>
@@ -5428,11 +3689,9 @@
       <w:pPr>
         <w:pStyle w:val="Heading3"/>
       </w:pPr>
-      <w:bookmarkStart w:name="_Toc19" w:id="19"/>
       <w:r>
         <w:t xml:space="preserve">Sincrono e asincrono</w:t>
       </w:r>
-      <w:bookmarkEnd w:id="19"/>
     </w:p>
     <w:p>
       <w:pPr>
@@ -5447,11 +3706,11 @@
       <w:pPr>
         <w:pStyle w:val="Heading1"/>
       </w:pPr>
-      <w:bookmarkStart w:name="_Toc20" w:id="20"/>
+      <w:bookmarkStart w:name="_Toc9" w:id="9"/>
       <w:r>
         <w:t xml:space="preserve">3. Come comunicano i componenti</w:t>
       </w:r>
-      <w:bookmarkEnd w:id="20"/>
+      <w:bookmarkEnd w:id="9"/>
     </w:p>
     <w:p>
       <w:pPr>
@@ -5486,11 +3745,9 @@
       <w:pPr>
         <w:pStyle w:val="Heading3"/>
       </w:pPr>
-      <w:bookmarkStart w:name="_Toc21" w:id="21"/>
       <w:r>
         <w:t xml:space="preserve">Lo schema comune</w:t>
       </w:r>
-      <w:bookmarkEnd w:id="21"/>
     </w:p>
     <w:p>
       <w:pPr>
@@ -5505,11 +3762,9 @@
       <w:pPr>
         <w:pStyle w:val="Heading3"/>
       </w:pPr>
-      <w:bookmarkStart w:name="_Toc22" w:id="22"/>
       <w:r>
         <w:t xml:space="preserve">I sette flussi</w:t>
       </w:r>
-      <w:bookmarkEnd w:id="22"/>
     </w:p>
     <w:tbl>
       <w:tblPr>
@@ -6296,11 +4551,11 @@
       <w:pPr>
         <w:pStyle w:val="Heading2"/>
       </w:pPr>
-      <w:bookmarkStart w:name="_Toc23" w:id="23"/>
+      <w:bookmarkStart w:name="_Toc10" w:id="10"/>
       <w:r>
         <w:t xml:space="preserve">3.1 Scaricare l'applicazione</w:t>
       </w:r>
-      <w:bookmarkEnd w:id="23"/>
+      <w:bookmarkEnd w:id="10"/>
     </w:p>
     <w:p>
       <w:pPr>
@@ -6350,7 +4605,7 @@
       <w:r>
         <w:drawing>
           <wp:inline distT="0" distB="0" distL="0" distR="0">
-            <wp:extent cx="6124575" cy="8201025"/>
+            <wp:extent cx="3695700" cy="4953000"/>
             <wp:effectExtent t="0" r="0" b="0" l="0"/>
             <wp:docPr id="2" name=""/>
             <wp:cNvGraphicFramePr>
@@ -6375,7 +4630,7 @@
                   <pic:spPr bwMode="auto">
                     <a:xfrm>
                       <a:off x="0" y="0"/>
-                      <a:ext cx="6124575" cy="8201025"/>
+                      <a:ext cx="3695700" cy="4953000"/>
                     </a:xfrm>
                     <a:prstGeom prst="rect">
                       <a:avLst/>
@@ -6408,11 +4663,9 @@
       <w:pPr>
         <w:pStyle w:val="Heading3"/>
       </w:pPr>
-      <w:bookmarkStart w:name="_Toc24" w:id="24"/>
       <w:r>
         <w:t xml:space="preserve">Il percorso</w:t>
       </w:r>
-      <w:bookmarkEnd w:id="24"/>
     </w:p>
     <w:p>
       <w:pPr>
@@ -6507,11 +4760,9 @@
       <w:pPr>
         <w:pStyle w:val="Heading3"/>
       </w:pPr>
-      <w:bookmarkStart w:name="_Toc25" w:id="25"/>
       <w:r>
         <w:t xml:space="preserve">Chi parla con chi</w:t>
       </w:r>
-      <w:bookmarkEnd w:id="25"/>
     </w:p>
     <w:tbl>
       <w:tblPr>
@@ -6958,11 +5209,9 @@
       <w:pPr>
         <w:pStyle w:val="Heading3"/>
       </w:pPr>
-      <w:bookmarkStart w:name="_Toc26" w:id="26"/>
       <w:r>
         <w:t xml:space="preserve">L'autorizzazione chiave</w:t>
       </w:r>
-      <w:bookmarkEnd w:id="26"/>
     </w:p>
     <w:p>
       <w:pPr>
@@ -7823,11 +6072,9 @@
       <w:pPr>
         <w:pStyle w:val="Heading3"/>
       </w:pPr>
-      <w:bookmarkStart w:name="_Toc27" w:id="27"/>
       <w:r>
         <w:t xml:space="preserve">Quando qualcosa va storto</w:t>
       </w:r>
-      <w:bookmarkEnd w:id="27"/>
     </w:p>
     <w:p>
       <w:pPr>
@@ -7854,11 +6101,9 @@
       <w:pPr>
         <w:pStyle w:val="Heading3"/>
       </w:pPr>
-      <w:bookmarkStart w:name="_Toc28" w:id="28"/>
       <w:r>
         <w:t xml:space="preserve">Le scelte</w:t>
       </w:r>
-      <w:bookmarkEnd w:id="28"/>
     </w:p>
     <w:p>
       <w:pPr>
@@ -7883,11 +6128,11 @@
       <w:pPr>
         <w:pStyle w:val="Heading2"/>
       </w:pPr>
-      <w:bookmarkStart w:name="_Toc29" w:id="29"/>
+      <w:bookmarkStart w:name="_Toc11" w:id="11"/>
       <w:r>
         <w:t xml:space="preserve">3.2 Login e chiamate all'API</w:t>
       </w:r>
-      <w:bookmarkEnd w:id="29"/>
+      <w:bookmarkEnd w:id="11"/>
     </w:p>
     <w:p>
       <w:pPr>
@@ -8044,11 +6289,9 @@
       <w:pPr>
         <w:pStyle w:val="Heading3"/>
       </w:pPr>
-      <w:bookmarkStart w:name="_Toc30" w:id="30"/>
       <w:r>
         <w:t xml:space="preserve">Il percorso</w:t>
       </w:r>
-      <w:bookmarkEnd w:id="30"/>
     </w:p>
     <w:p>
       <w:pPr>
@@ -8255,11 +6498,9 @@
       <w:pPr>
         <w:pStyle w:val="Heading3"/>
       </w:pPr>
-      <w:bookmarkStart w:name="_Toc31" w:id="31"/>
       <w:r>
         <w:t xml:space="preserve">Chi parla con chi</w:t>
       </w:r>
-      <w:bookmarkEnd w:id="31"/>
     </w:p>
     <w:p>
       <w:pPr>
@@ -8910,11 +7151,9 @@
       <w:pPr>
         <w:pStyle w:val="Heading3"/>
       </w:pPr>
-      <w:bookmarkStart w:name="_Toc32" w:id="32"/>
       <w:r>
         <w:t xml:space="preserve">I token</w:t>
       </w:r>
-      <w:bookmarkEnd w:id="32"/>
     </w:p>
     <w:p>
       <w:pPr>
@@ -10168,11 +8407,9 @@
       <w:pPr>
         <w:pStyle w:val="Heading3"/>
       </w:pPr>
-      <w:bookmarkStart w:name="_Toc33" w:id="33"/>
       <w:r>
         <w:t xml:space="preserve">L'authorizer JWT</w:t>
       </w:r>
-      <w:bookmarkEnd w:id="33"/>
     </w:p>
     <w:p>
       <w:pPr>
@@ -10270,11 +8507,9 @@
       <w:pPr>
         <w:pStyle w:val="Heading3"/>
       </w:pPr>
-      <w:bookmarkStart w:name="_Toc34" w:id="34"/>
       <w:r>
         <w:t xml:space="preserve">Chi può invocare la Lambda</w:t>
       </w:r>
-      <w:bookmarkEnd w:id="34"/>
     </w:p>
     <w:p>
       <w:pPr>
@@ -10840,11 +9075,9 @@
       <w:pPr>
         <w:pStyle w:val="Heading3"/>
       </w:pPr>
-      <w:bookmarkStart w:name="_Toc35" w:id="35"/>
       <w:r>
         <w:t xml:space="preserve">Cosa decide la Lambda</w:t>
       </w:r>
-      <w:bookmarkEnd w:id="35"/>
     </w:p>
     <w:p>
       <w:pPr>
@@ -11033,11 +9266,9 @@
       <w:pPr>
         <w:pStyle w:val="Heading3"/>
       </w:pPr>
-      <w:bookmarkStart w:name="_Toc36" w:id="36"/>
       <w:r>
         <w:t xml:space="preserve">Quando qualcosa va storto</w:t>
       </w:r>
-      <w:bookmarkEnd w:id="36"/>
     </w:p>
     <w:tbl>
       <w:tblPr>
@@ -11425,11 +9656,9 @@
       <w:pPr>
         <w:pStyle w:val="Heading3"/>
       </w:pPr>
-      <w:bookmarkStart w:name="_Toc37" w:id="37"/>
       <w:r>
         <w:t xml:space="preserve">Furto del token e rischio residuo</w:t>
       </w:r>
-      <w:bookmarkEnd w:id="37"/>
     </w:p>
     <w:p>
       <w:pPr>
@@ -11500,11 +9729,9 @@
       <w:pPr>
         <w:pStyle w:val="Heading3"/>
       </w:pPr>
-      <w:bookmarkStart w:name="_Toc38" w:id="38"/>
       <w:r>
         <w:t xml:space="preserve">Le scelte</w:t>
       </w:r>
-      <w:bookmarkEnd w:id="38"/>
     </w:p>
     <w:p>
       <w:pPr>
@@ -11531,11 +9758,11 @@
       <w:pPr>
         <w:pStyle w:val="Heading2"/>
       </w:pPr>
-      <w:bookmarkStart w:name="_Toc39" w:id="39"/>
+      <w:bookmarkStart w:name="_Toc12" w:id="12"/>
       <w:r>
         <w:t xml:space="preserve">3.3 Dalla Lambda al database</w:t>
       </w:r>
-      <w:bookmarkEnd w:id="39"/>
+      <w:bookmarkEnd w:id="12"/>
     </w:p>
     <w:p>
       <w:pPr>
@@ -11657,11 +9884,9 @@
       <w:pPr>
         <w:pStyle w:val="Heading3"/>
       </w:pPr>
-      <w:bookmarkStart w:name="_Toc40" w:id="40"/>
       <w:r>
         <w:t xml:space="preserve">Il percorso</w:t>
       </w:r>
-      <w:bookmarkEnd w:id="40"/>
     </w:p>
     <w:p>
       <w:pPr>
@@ -11783,11 +10008,9 @@
       <w:pPr>
         <w:pStyle w:val="Heading3"/>
       </w:pPr>
-      <w:bookmarkStart w:name="_Toc41" w:id="41"/>
       <w:r>
         <w:t xml:space="preserve">Chi parla con chi</w:t>
       </w:r>
-      <w:bookmarkEnd w:id="41"/>
     </w:p>
     <w:tbl>
       <w:tblPr>
@@ -12347,11 +10570,9 @@
       <w:pPr>
         <w:pStyle w:val="Heading3"/>
       </w:pPr>
-      <w:bookmarkStart w:name="_Toc42" w:id="42"/>
       <w:r>
         <w:t xml:space="preserve">Le autorizzazioni</w:t>
       </w:r>
-      <w:bookmarkEnd w:id="42"/>
     </w:p>
     <w:p>
       <w:pPr>
@@ -13213,11 +11434,9 @@
       <w:pPr>
         <w:pStyle w:val="Heading3"/>
       </w:pPr>
-      <w:bookmarkStart w:name="_Toc43" w:id="43"/>
       <w:r>
         <w:t xml:space="preserve">Quando qualcosa va storto</w:t>
       </w:r>
-      <w:bookmarkEnd w:id="43"/>
     </w:p>
     <w:p>
       <w:pPr>
@@ -13340,11 +11559,9 @@
       <w:pPr>
         <w:pStyle w:val="Heading3"/>
       </w:pPr>
-      <w:bookmarkStart w:name="_Toc44" w:id="44"/>
       <w:r>
         <w:t xml:space="preserve">Le scelte</w:t>
       </w:r>
-      <w:bookmarkEnd w:id="44"/>
     </w:p>
     <w:p>
       <w:pPr>
@@ -13359,11 +11576,11 @@
       <w:pPr>
         <w:pStyle w:val="Heading2"/>
       </w:pPr>
-      <w:bookmarkStart w:name="_Toc45" w:id="45"/>
+      <w:bookmarkStart w:name="_Toc13" w:id="13"/>
       <w:r>
         <w:t xml:space="preserve">3.4 Caricare e servire i file</w:t>
       </w:r>
-      <w:bookmarkEnd w:id="45"/>
+      <w:bookmarkEnd w:id="13"/>
     </w:p>
     <w:p>
       <w:pPr>
@@ -13427,7 +11644,7 @@
       <w:r>
         <w:drawing>
           <wp:inline distT="0" distB="0" distL="0" distR="0">
-            <wp:extent cx="6124575" cy="6581775"/>
+            <wp:extent cx="4610100" cy="4953000"/>
             <wp:effectExtent t="0" r="0" b="0" l="0"/>
             <wp:docPr id="5" name=""/>
             <wp:cNvGraphicFramePr>
@@ -13452,7 +11669,7 @@
                   <pic:spPr bwMode="auto">
                     <a:xfrm>
                       <a:off x="0" y="0"/>
-                      <a:ext cx="6124575" cy="6581775"/>
+                      <a:ext cx="4610100" cy="4953000"/>
                     </a:xfrm>
                     <a:prstGeom prst="rect">
                       <a:avLst/>
@@ -13485,11 +11702,9 @@
       <w:pPr>
         <w:pStyle w:val="Heading3"/>
       </w:pPr>
-      <w:bookmarkStart w:name="_Toc46" w:id="46"/>
       <w:r>
         <w:t xml:space="preserve">Il percorso</w:t>
       </w:r>
-      <w:bookmarkEnd w:id="46"/>
     </w:p>
     <w:p>
       <w:pPr>
@@ -13713,11 +11928,9 @@
       <w:pPr>
         <w:pStyle w:val="Heading3"/>
       </w:pPr>
-      <w:bookmarkStart w:name="_Toc47" w:id="47"/>
       <w:r>
         <w:t xml:space="preserve">Chi parla con chi</w:t>
       </w:r>
-      <w:bookmarkEnd w:id="47"/>
     </w:p>
     <w:tbl>
       <w:tblPr>
@@ -14401,11 +12614,9 @@
       <w:pPr>
         <w:pStyle w:val="Heading3"/>
       </w:pPr>
-      <w:bookmarkStart w:name="_Toc48" w:id="48"/>
       <w:r>
         <w:t xml:space="preserve">Le autorizzazioni</w:t>
       </w:r>
-      <w:bookmarkEnd w:id="48"/>
     </w:p>
     <w:p>
       <w:pPr>
@@ -15581,11 +13792,9 @@
       <w:pPr>
         <w:pStyle w:val="Heading3"/>
       </w:pPr>
-      <w:bookmarkStart w:name="_Toc49" w:id="49"/>
       <w:r>
         <w:t xml:space="preserve">Quando qualcosa va storto</w:t>
       </w:r>
-      <w:bookmarkEnd w:id="49"/>
     </w:p>
     <w:p>
       <w:pPr>
@@ -15640,11 +13849,9 @@
       <w:pPr>
         <w:pStyle w:val="Heading3"/>
       </w:pPr>
-      <w:bookmarkStart w:name="_Toc50" w:id="50"/>
       <w:r>
         <w:t xml:space="preserve">Le scelte</w:t>
       </w:r>
-      <w:bookmarkEnd w:id="50"/>
     </w:p>
     <w:p>
       <w:pPr>
@@ -15659,11 +13866,11 @@
       <w:pPr>
         <w:pStyle w:val="Heading2"/>
       </w:pPr>
-      <w:bookmarkStart w:name="_Toc51" w:id="51"/>
+      <w:bookmarkStart w:name="_Toc14" w:id="14"/>
       <w:r>
         <w:t xml:space="preserve">3.5 Le notifiche email e la dead-letter queue</w:t>
       </w:r>
-      <w:bookmarkEnd w:id="51"/>
+      <w:bookmarkEnd w:id="14"/>
     </w:p>
     <w:p>
       <w:pPr>
@@ -15761,11 +13968,9 @@
       <w:pPr>
         <w:pStyle w:val="Heading3"/>
       </w:pPr>
-      <w:bookmarkStart w:name="_Toc52" w:id="52"/>
       <w:r>
         <w:t xml:space="preserve">Il percorso</w:t>
       </w:r>
-      <w:bookmarkEnd w:id="52"/>
     </w:p>
     <w:p>
       <w:pPr>
@@ -15933,11 +14138,9 @@
       <w:pPr>
         <w:pStyle w:val="Heading3"/>
       </w:pPr>
-      <w:bookmarkStart w:name="_Toc53" w:id="53"/>
       <w:r>
         <w:t xml:space="preserve">Chi parla con chi</w:t>
       </w:r>
-      <w:bookmarkEnd w:id="53"/>
     </w:p>
     <w:tbl>
       <w:tblPr>
@@ -16691,11 +14894,9 @@
       <w:pPr>
         <w:pStyle w:val="Heading3"/>
       </w:pPr>
-      <w:bookmarkStart w:name="_Toc54" w:id="54"/>
       <w:r>
         <w:t xml:space="preserve">Le autorizzazioni</w:t>
       </w:r>
-      <w:bookmarkEnd w:id="54"/>
     </w:p>
     <w:p>
       <w:pPr>
@@ -17914,11 +16115,9 @@
       <w:pPr>
         <w:pStyle w:val="Heading3"/>
       </w:pPr>
-      <w:bookmarkStart w:name="_Toc55" w:id="55"/>
       <w:r>
         <w:t xml:space="preserve">Quando qualcosa va storto: la dead-letter queue</w:t>
       </w:r>
-      <w:bookmarkEnd w:id="55"/>
     </w:p>
     <w:p>
       <w:pPr>
@@ -18505,11 +16704,9 @@
       <w:pPr>
         <w:pStyle w:val="Heading3"/>
       </w:pPr>
-      <w:bookmarkStart w:name="_Toc56" w:id="56"/>
       <w:r>
         <w:t xml:space="preserve">L'allarme e cosa fa il team</w:t>
       </w:r>
-      <w:bookmarkEnd w:id="56"/>
     </w:p>
     <w:p>
       <w:pPr>
@@ -18567,11 +16764,9 @@
       <w:pPr>
         <w:pStyle w:val="Heading3"/>
       </w:pPr>
-      <w:bookmarkStart w:name="_Toc57" w:id="57"/>
       <w:r>
         <w:t xml:space="preserve">Le scelte</w:t>
       </w:r>
-      <w:bookmarkEnd w:id="57"/>
     </w:p>
     <w:p>
       <w:pPr>
@@ -18586,11 +16781,11 @@
       <w:pPr>
         <w:pStyle w:val="Heading2"/>
       </w:pPr>
-      <w:bookmarkStart w:name="_Toc58" w:id="58"/>
+      <w:bookmarkStart w:name="_Toc15" w:id="15"/>
       <w:r>
         <w:t xml:space="preserve">3.6 Gestione e cancellazione dell'account</w:t>
       </w:r>
-      <w:bookmarkEnd w:id="58"/>
+      <w:bookmarkEnd w:id="15"/>
     </w:p>
     <w:p>
       <w:pPr>
@@ -18698,11 +16893,9 @@
       <w:pPr>
         <w:pStyle w:val="Heading3"/>
       </w:pPr>
-      <w:bookmarkStart w:name="_Toc59" w:id="59"/>
       <w:r>
         <w:t xml:space="preserve">Il percorso</w:t>
       </w:r>
-      <w:bookmarkEnd w:id="59"/>
     </w:p>
     <w:p>
       <w:pPr>
@@ -18858,11 +17051,9 @@
       <w:pPr>
         <w:pStyle w:val="Heading3"/>
       </w:pPr>
-      <w:bookmarkStart w:name="_Toc60" w:id="60"/>
       <w:r>
         <w:t xml:space="preserve">Chi parla con chi</w:t>
       </w:r>
-      <w:bookmarkEnd w:id="60"/>
     </w:p>
     <w:tbl>
       <w:tblPr>
@@ -19474,11 +17665,9 @@
       <w:pPr>
         <w:pStyle w:val="Heading3"/>
       </w:pPr>
-      <w:bookmarkStart w:name="_Toc61" w:id="61"/>
       <w:r>
         <w:t xml:space="preserve">Le autorizzazioni chiave</w:t>
       </w:r>
-      <w:bookmarkEnd w:id="61"/>
     </w:p>
     <w:p>
       <w:pPr>
@@ -20034,11 +18223,9 @@
       <w:pPr>
         <w:pStyle w:val="Heading3"/>
       </w:pPr>
-      <w:bookmarkStart w:name="_Toc62" w:id="62"/>
       <w:r>
         <w:t xml:space="preserve">L'ordine e l'anonimizzazione</w:t>
       </w:r>
-      <w:bookmarkEnd w:id="62"/>
     </w:p>
     <w:p>
       <w:pPr>
@@ -20185,11 +18372,9 @@
       <w:pPr>
         <w:pStyle w:val="Heading3"/>
       </w:pPr>
-      <w:bookmarkStart w:name="_Toc63" w:id="63"/>
       <w:r>
         <w:t xml:space="preserve">Quando qualcosa va storto</w:t>
       </w:r>
-      <w:bookmarkEnd w:id="63"/>
     </w:p>
     <w:p>
       <w:pPr>
@@ -20226,11 +18411,9 @@
       <w:pPr>
         <w:pStyle w:val="Heading3"/>
       </w:pPr>
-      <w:bookmarkStart w:name="_Toc64" w:id="64"/>
       <w:r>
         <w:t xml:space="preserve">Le scelte</w:t>
       </w:r>
-      <w:bookmarkEnd w:id="64"/>
     </w:p>
     <w:p>
       <w:pPr>
@@ -20257,11 +18440,11 @@
       <w:pPr>
         <w:pStyle w:val="Heading2"/>
       </w:pPr>
-      <w:bookmarkStart w:name="_Toc65" w:id="65"/>
+      <w:bookmarkStart w:name="_Toc16" w:id="16"/>
       <w:r>
         <w:t xml:space="preserve">3.7 Log, metriche e allarmi</w:t>
       </w:r>
-      <w:bookmarkEnd w:id="65"/>
+      <w:bookmarkEnd w:id="16"/>
     </w:p>
     <w:p>
       <w:pPr>
@@ -20371,11 +18554,9 @@
       <w:pPr>
         <w:pStyle w:val="Heading3"/>
       </w:pPr>
-      <w:bookmarkStart w:name="_Toc66" w:id="66"/>
       <w:r>
         <w:t xml:space="preserve">Il percorso</w:t>
       </w:r>
-      <w:bookmarkEnd w:id="66"/>
     </w:p>
     <w:p>
       <w:pPr>
@@ -20455,11 +18636,9 @@
       <w:pPr>
         <w:pStyle w:val="Heading3"/>
       </w:pPr>
-      <w:bookmarkStart w:name="_Toc67" w:id="67"/>
       <w:r>
         <w:t xml:space="preserve">Chi parla con chi</w:t>
       </w:r>
-      <w:bookmarkEnd w:id="67"/>
     </w:p>
     <w:tbl>
       <w:tblPr>
@@ -20994,11 +19173,9 @@
       <w:pPr>
         <w:pStyle w:val="Heading3"/>
       </w:pPr>
-      <w:bookmarkStart w:name="_Toc68" w:id="68"/>
       <w:r>
         <w:t xml:space="preserve">Le autorizzazioni chiave</w:t>
       </w:r>
-      <w:bookmarkEnd w:id="68"/>
     </w:p>
     <w:p>
       <w:pPr>
@@ -21320,11 +19497,9 @@
       <w:pPr>
         <w:pStyle w:val="Heading3"/>
       </w:pPr>
-      <w:bookmarkStart w:name="_Toc69" w:id="69"/>
       <w:r>
         <w:t xml:space="preserve">Gli allarmi</w:t>
       </w:r>
-      <w:bookmarkEnd w:id="69"/>
     </w:p>
     <w:tbl>
       <w:tblPr>
@@ -21808,11 +19983,9 @@
       <w:pPr>
         <w:pStyle w:val="Heading3"/>
       </w:pPr>
-      <w:bookmarkStart w:name="_Toc70" w:id="70"/>
       <w:r>
         <w:t xml:space="preserve">Quando qualcosa va storto</w:t>
       </w:r>
-      <w:bookmarkEnd w:id="70"/>
     </w:p>
     <w:p>
       <w:pPr>
@@ -21827,11 +20000,9 @@
       <w:pPr>
         <w:pStyle w:val="Heading3"/>
       </w:pPr>
-      <w:bookmarkStart w:name="_Toc71" w:id="71"/>
       <w:r>
         <w:t xml:space="preserve">Le scelte</w:t>
       </w:r>
-      <w:bookmarkEnd w:id="71"/>
     </w:p>
     <w:p>
       <w:pPr>
@@ -21846,11 +20017,11 @@
       <w:pPr>
         <w:pStyle w:val="Heading1"/>
       </w:pPr>
-      <w:bookmarkStart w:name="_Toc72" w:id="72"/>
+      <w:bookmarkStart w:name="_Toc17" w:id="17"/>
       <w:r>
         <w:t xml:space="preserve">4. Sicurezza e IAM</w:t>
       </w:r>
-      <w:bookmarkEnd w:id="72"/>
+      <w:bookmarkEnd w:id="17"/>
     </w:p>
     <w:p>
       <w:pPr>
@@ -21911,11 +20082,11 @@
       <w:pPr>
         <w:pStyle w:val="Heading2"/>
       </w:pPr>
-      <w:bookmarkStart w:name="_Toc73" w:id="73"/>
+      <w:bookmarkStart w:name="_Toc18" w:id="18"/>
       <w:r>
         <w:t xml:space="preserve">4.1 Le tre facce di IAM</w:t>
       </w:r>
-      <w:bookmarkEnd w:id="73"/>
+      <w:bookmarkEnd w:id="18"/>
     </w:p>
     <w:p>
       <w:pPr>
@@ -22454,11 +20625,9 @@
       <w:pPr>
         <w:pStyle w:val="Heading3"/>
       </w:pPr>
-      <w:bookmarkStart w:name="_Toc74" w:id="74"/>
       <w:r>
         <w:t xml:space="preserve">Come si valuta una richiesta</w:t>
       </w:r>
-      <w:bookmarkEnd w:id="74"/>
     </w:p>
     <w:p>
       <w:pPr>
@@ -22625,11 +20794,9 @@
       <w:pPr>
         <w:pStyle w:val="Heading3"/>
       </w:pPr>
-      <w:bookmarkStart w:name="_Toc75" w:id="75"/>
       <w:r>
         <w:t xml:space="preserve">Confused deputy</w:t>
       </w:r>
-      <w:bookmarkEnd w:id="75"/>
     </w:p>
     <w:p>
       <w:pPr>
@@ -22690,11 +20857,9 @@
       <w:pPr>
         <w:pStyle w:val="Heading3"/>
       </w:pPr>
-      <w:bookmarkStart w:name="_Toc76" w:id="76"/>
       <w:r>
         <w:t xml:space="preserve">Privilegio minimo e iam:PassRole</w:t>
       </w:r>
-      <w:bookmarkEnd w:id="76"/>
     </w:p>
     <w:p>
       <w:pPr>
@@ -22918,11 +21083,11 @@
       <w:pPr>
         <w:pStyle w:val="Heading2"/>
       </w:pPr>
-      <w:bookmarkStart w:name="_Toc77" w:id="77"/>
+      <w:bookmarkStart w:name="_Toc19" w:id="19"/>
       <w:r>
         <w:t xml:space="preserve">4.2 La rete come secondo livello</w:t>
       </w:r>
-      <w:bookmarkEnd w:id="77"/>
+      <w:bookmarkEnd w:id="19"/>
     </w:p>
     <w:p>
       <w:pPr>
@@ -23783,11 +21948,11 @@
       <w:pPr>
         <w:pStyle w:val="Heading2"/>
       </w:pPr>
-      <w:bookmarkStart w:name="_Toc78" w:id="78"/>
+      <w:bookmarkStart w:name="_Toc20" w:id="20"/>
       <w:r>
         <w:t xml:space="preserve">4.3 La mappa delle autorizzazioni</w:t>
       </w:r>
-      <w:bookmarkEnd w:id="78"/>
+      <w:bookmarkEnd w:id="20"/>
     </w:p>
     <w:p>
       <w:pPr>
@@ -26854,11 +25019,11 @@
       <w:pPr>
         <w:pStyle w:val="Heading1"/>
       </w:pPr>
-      <w:bookmarkStart w:name="_Toc79" w:id="79"/>
+      <w:bookmarkStart w:name="_Toc21" w:id="21"/>
       <w:r>
         <w:t xml:space="preserve">5. Decisioni, alternative e limiti</w:t>
       </w:r>
-      <w:bookmarkEnd w:id="79"/>
+      <w:bookmarkEnd w:id="21"/>
     </w:p>
     <w:p>
       <w:pPr>
@@ -26873,11 +25038,11 @@
       <w:pPr>
         <w:pStyle w:val="Heading2"/>
       </w:pPr>
-      <w:bookmarkStart w:name="_Toc80" w:id="80"/>
+      <w:bookmarkStart w:name="_Toc22" w:id="22"/>
       <w:r>
         <w:t xml:space="preserve">5.1 Le decisioni principali</w:t>
       </w:r>
-      <w:bookmarkEnd w:id="80"/>
+      <w:bookmarkEnd w:id="22"/>
     </w:p>
     <w:tbl>
       <w:tblPr>
@@ -28297,11 +26462,11 @@
       <w:pPr>
         <w:pStyle w:val="Heading2"/>
       </w:pPr>
-      <w:bookmarkStart w:name="_Toc81" w:id="81"/>
+      <w:bookmarkStart w:name="_Toc23" w:id="23"/>
       <w:r>
         <w:t xml:space="preserve">5.2 Limiti e rischi dichiarati</w:t>
       </w:r>
-      <w:bookmarkEnd w:id="81"/>
+      <w:bookmarkEnd w:id="23"/>
     </w:p>
     <w:p>
       <w:pPr>
@@ -28499,11 +26664,11 @@
       <w:pPr>
         <w:pStyle w:val="Heading2"/>
       </w:pPr>
-      <w:bookmarkStart w:name="_Toc82" w:id="82"/>
+      <w:bookmarkStart w:name="_Toc24" w:id="24"/>
       <w:r>
         <w:t xml:space="preserve">5.3 Sviluppi possibili</w:t>
       </w:r>
-      <w:bookmarkEnd w:id="82"/>
+      <w:bookmarkEnd w:id="24"/>
     </w:p>
     <w:p>
       <w:pPr>
@@ -28709,11 +26874,11 @@
       <w:pPr>
         <w:pStyle w:val="Heading1"/>
       </w:pPr>
-      <w:bookmarkStart w:name="_Toc83" w:id="83"/>
+      <w:bookmarkStart w:name="_Toc25" w:id="25"/>
       <w:r>
         <w:t xml:space="preserve">Appendice A — Ruoli e policy</w:t>
       </w:r>
-      <w:bookmarkEnd w:id="83"/>
+      <w:bookmarkEnd w:id="25"/>
     </w:p>
     <w:p>
       <w:pPr>
@@ -28752,11 +26917,11 @@
       <w:pPr>
         <w:pStyle w:val="Heading2"/>
       </w:pPr>
-      <w:bookmarkStart w:name="_Toc84" w:id="84"/>
+      <w:bookmarkStart w:name="_Toc26" w:id="26"/>
       <w:r>
         <w:t xml:space="preserve">A.1 I ruoli</w:t>
       </w:r>
-      <w:bookmarkEnd w:id="84"/>
+      <w:bookmarkEnd w:id="26"/>
     </w:p>
     <w:p>
       <w:pPr>
@@ -30344,11 +28509,11 @@
       <w:pPr>
         <w:pStyle w:val="Heading2"/>
       </w:pPr>
-      <w:bookmarkStart w:name="_Toc85" w:id="85"/>
+      <w:bookmarkStart w:name="_Toc27" w:id="27"/>
       <w:r>
         <w:t xml:space="preserve">A.2 Le resource policy</w:t>
       </w:r>
-      <w:bookmarkEnd w:id="85"/>
+      <w:bookmarkEnd w:id="27"/>
     </w:p>
     <w:tbl>
       <w:tblPr>
@@ -31762,21 +29927,19 @@
       <w:pPr>
         <w:pStyle w:val="Heading2"/>
       </w:pPr>
-      <w:bookmarkStart w:name="_Toc86" w:id="86"/>
+      <w:bookmarkStart w:name="_Toc28" w:id="28"/>
       <w:r>
         <w:t xml:space="preserve">A.3 Testo integrale dei JSON</w:t>
       </w:r>
-      <w:bookmarkEnd w:id="86"/>
+      <w:bookmarkEnd w:id="28"/>
     </w:p>
     <w:p>
       <w:pPr>
         <w:pStyle w:val="Heading3"/>
       </w:pPr>
-      <w:bookmarkStart w:name="_Toc87" w:id="87"/>
       <w:r>
         <w:t xml:space="preserve">Trust relationship</w:t>
       </w:r>
-      <w:bookmarkEnd w:id="87"/>
     </w:p>
     <w:p>
       <w:pPr>
@@ -32254,11 +30417,9 @@
       <w:pPr>
         <w:pStyle w:val="Heading3"/>
       </w:pPr>
-      <w:bookmarkStart w:name="_Toc88" w:id="88"/>
       <w:r>
         <w:t xml:space="preserve">Identity policy dei ruoli delle Lambda</w:t>
       </w:r>
-      <w:bookmarkEnd w:id="88"/>
     </w:p>
     <w:p>
       <w:pPr>
@@ -35297,11 +33458,9 @@
       <w:pPr>
         <w:pStyle w:val="Heading3"/>
       </w:pPr>
-      <w:bookmarkStart w:name="_Toc89" w:id="89"/>
       <w:r>
         <w:t xml:space="preserve">Identity policy del ruolo del proxy</w:t>
       </w:r>
-      <w:bookmarkEnd w:id="89"/>
     </w:p>
     <w:p>
       <w:pPr>
@@ -35888,11 +34047,9 @@
       <w:pPr>
         <w:pStyle w:val="Heading3"/>
       </w:pPr>
-      <w:bookmarkStart w:name="_Toc90" w:id="90"/>
       <w:r>
         <w:t xml:space="preserve">Policy per le persone del team</w:t>
       </w:r>
-      <w:bookmarkEnd w:id="90"/>
     </w:p>
     <w:p>
       <w:pPr>
@@ -36930,11 +35087,9 @@
       <w:pPr>
         <w:pStyle w:val="Heading3"/>
       </w:pPr>
-      <w:bookmarkStart w:name="_Toc91" w:id="91"/>
       <w:r>
         <w:t xml:space="preserve">Resource policy delle Lambda</w:t>
       </w:r>
-      <w:bookmarkEnd w:id="91"/>
     </w:p>
     <w:p>
       <w:pPr>
@@ -37832,11 +35987,9 @@
       <w:pPr>
         <w:pStyle w:val="Heading3"/>
       </w:pPr>
-      <w:bookmarkStart w:name="_Toc92" w:id="92"/>
       <w:r>
         <w:t xml:space="preserve">Bucket policy</w:t>
       </w:r>
-      <w:bookmarkEnd w:id="92"/>
     </w:p>
     <w:p>
       <w:pPr>
@@ -39234,11 +37387,9 @@
       <w:pPr>
         <w:pStyle w:val="Heading3"/>
       </w:pPr>
-      <w:bookmarkStart w:name="_Toc93" w:id="93"/>
       <w:r>
         <w:t xml:space="preserve">Queue policy</w:t>
       </w:r>
-      <w:bookmarkEnd w:id="93"/>
     </w:p>
     <w:p>
       <w:pPr>
@@ -39640,11 +37791,9 @@
       <w:pPr>
         <w:pStyle w:val="Heading3"/>
       </w:pPr>
-      <w:bookmarkStart w:name="_Toc94" w:id="94"/>
       <w:r>
         <w:t xml:space="preserve">Endpoint policy</w:t>
       </w:r>
-      <w:bookmarkEnd w:id="94"/>
     </w:p>
     <w:p>
       <w:pPr>
@@ -40006,11 +38155,11 @@
       <w:pPr>
         <w:pStyle w:val="Heading1"/>
       </w:pPr>
-      <w:bookmarkStart w:name="_Toc95" w:id="95"/>
+      <w:bookmarkStart w:name="_Toc29" w:id="29"/>
       <w:r>
         <w:t xml:space="preserve">Appendice B — Configurazioni</w:t>
       </w:r>
-      <w:bookmarkEnd w:id="95"/>
+      <w:bookmarkEnd w:id="29"/>
     </w:p>
     <w:p>
       <w:pPr>
@@ -40049,11 +38198,9 @@
       <w:pPr>
         <w:pStyle w:val="Heading3"/>
       </w:pPr>
-      <w:bookmarkStart w:name="_Toc96" w:id="96"/>
       <w:r>
         <w:t xml:space="preserve">cognito-user-pool.json</w:t>
       </w:r>
-      <w:bookmarkEnd w:id="96"/>
     </w:p>
     <w:p>
       <w:pPr>
@@ -40524,11 +38671,9 @@
       <w:pPr>
         <w:pStyle w:val="Heading3"/>
       </w:pPr>
-      <w:bookmarkStart w:name="_Toc97" w:id="97"/>
       <w:r>
         <w:t xml:space="preserve">cognito-app-client.json</w:t>
       </w:r>
-      <w:bookmarkEnd w:id="97"/>
     </w:p>
     <w:p>
       <w:pPr>
@@ -41239,11 +39384,9 @@
       <w:pPr>
         <w:pStyle w:val="Heading3"/>
       </w:pPr>
-      <w:bookmarkStart w:name="_Toc98" w:id="98"/>
       <w:r>
         <w:t xml:space="preserve">http-api-cors.json</w:t>
       </w:r>
-      <w:bookmarkEnd w:id="98"/>
     </w:p>
     <w:p>
       <w:pPr>
@@ -41594,11 +39737,9 @@
       <w:pPr>
         <w:pStyle w:val="Heading3"/>
       </w:pPr>
-      <w:bookmarkStart w:name="_Toc99" w:id="99"/>
       <w:r>
         <w:t xml:space="preserve">presigned-post-conditions.json</w:t>
       </w:r>
-      <w:bookmarkEnd w:id="99"/>
     </w:p>
     <w:p>
       <w:pPr>
@@ -42109,11 +40250,9 @@
       <w:pPr>
         <w:pStyle w:val="Heading3"/>
       </w:pPr>
-      <w:bookmarkStart w:name="_Toc100" w:id="100"/>
       <w:r>
         <w:t xml:space="preserve">s3-files-cors.json</w:t>
       </w:r>
-      <w:bookmarkEnd w:id="100"/>
     </w:p>
     <w:p>
       <w:pPr>
@@ -42496,11 +40635,9 @@
       <w:pPr>
         <w:pStyle w:val="Heading3"/>
       </w:pPr>
-      <w:bookmarkStart w:name="_Toc101" w:id="101"/>
       <w:r>
         <w:t xml:space="preserve">s3-files-notification.json</w:t>
       </w:r>
-      <w:bookmarkEnd w:id="101"/>
     </w:p>
     <w:p>
       <w:pPr>
@@ -42975,11 +41112,9 @@
       <w:pPr>
         <w:pStyle w:val="Heading3"/>
       </w:pPr>
-      <w:bookmarkStart w:name="_Toc102" w:id="102"/>
       <w:r>
         <w:t xml:space="preserve">sns-subscription-attributes.json</w:t>
       </w:r>
-      <w:bookmarkEnd w:id="102"/>
     </w:p>
     <w:p>
       <w:pPr>
@@ -43082,11 +41217,9 @@
       <w:pPr>
         <w:pStyle w:val="Heading3"/>
       </w:pPr>
-      <w:bookmarkStart w:name="_Toc103" w:id="103"/>
       <w:r>
         <w:t xml:space="preserve">sqs-notifications-queue-attributes.json</w:t>
       </w:r>
-      <w:bookmarkEnd w:id="103"/>
     </w:p>
     <w:p>
       <w:pPr>
@@ -43249,11 +41382,9 @@
       <w:pPr>
         <w:pStyle w:val="Heading3"/>
       </w:pPr>
-      <w:bookmarkStart w:name="_Toc104" w:id="104"/>
       <w:r>
         <w:t xml:space="preserve">sqs-notifications-dlq-attributes.json</w:t>
       </w:r>
-      <w:bookmarkEnd w:id="104"/>
     </w:p>
     <w:p>
       <w:pPr>
@@ -43396,11 +41527,9 @@
       <w:pPr>
         <w:pStyle w:val="Heading3"/>
       </w:pPr>
-      <w:bookmarkStart w:name="_Toc105" w:id="105"/>
       <w:r>
         <w:t xml:space="preserve">lambda-mailer-event-source-mapping.json</w:t>
       </w:r>
-      <w:bookmarkEnd w:id="105"/>
     </w:p>
     <w:p>
       <w:pPr>
@@ -43703,11 +41832,9 @@
       <w:pPr>
         <w:pStyle w:val="Heading3"/>
       </w:pPr>
-      <w:bookmarkStart w:name="_Toc106" w:id="106"/>
       <w:r>
         <w:t xml:space="preserve">cloudwatch-alarm-notifications-dlq.json</w:t>
       </w:r>
-      <w:bookmarkEnd w:id="106"/>
     </w:p>
     <w:p>
       <w:pPr>
@@ -44238,11 +42365,9 @@
       <w:pPr>
         <w:pStyle w:val="Heading3"/>
       </w:pPr>
-      <w:bookmarkStart w:name="_Toc107" w:id="107"/>
       <w:r>
         <w:t xml:space="preserve">cloudwatch-metric-filter-mailer-permanent-failures.json</w:t>
       </w:r>
-      <w:bookmarkEnd w:id="107"/>
     </w:p>
     <w:p>
       <w:pPr>
@@ -45254,10 +43379,11 @@
     <w:qFormat/>
     <w:pPr>
       <w:keepNext/>
+      <w:pageBreakBefore/>
       <w:pBdr>
         <w:bottom w:val="single" w:color="C4A27C" w:sz="8" w:space="4"/>
       </w:pBdr>
-      <w:spacing w:after="160" w:before="360"/>
+      <w:spacing w:after="160" w:before="0"/>
       <w:outlineLvl w:val="0"/>
     </w:pPr>
     <w:rPr>

</xml_diff>

<commit_message>
Database: da Aurora a RDS for PostgreSQL Multi-AZ (primaria e standby sincrona), su indicazione del docente, per costo e semplicita
Documentazione (aurora.md diventa rds-postgres.md), diagramma v4 accanto alla v3, viste parziali e relazione aggiornate.
</commit_message>
<xml_diff>
--- a/relazione/relazione.docx
+++ b/relazione/relazione.docx
@@ -119,7 +119,7 @@
       </w:r>
     </w:p>
     <w:p>
-      <w:hyperlink w:history="1" r:id="rIdxbnqbn_vdycvalgtqyl1g">
+      <w:hyperlink w:history="1" r:id="rIdcyjtcalgt2d-h71knc8oo">
         <w:r>
           <w:rPr>
             <w:rStyle w:val="Hyperlink"/>
@@ -1931,7 +1931,7 @@
         <w:t xml:space="preserve">serverless</w:t>
       </w:r>
       <w:r>
-        <w:t xml:space="preserve">: non ci sono server nostri, e ogni pezzo è un servizio gestito da AWS che si paga per uso e scala da sé. Il frontend è una SPA React servita da CloudFront; il backend è un'HTTP API di API Gateway che invoca funzioni Lambda; i dati stanno in Aurora PostgreSQL, i file in S3, gli utenti in Cognito. Il database vive in una </w:t>
+        <w:t xml:space="preserve">: non ci sono server nostri, e ogni pezzo è un servizio gestito da AWS che si paga per uso e scala da sé. Il frontend è una SPA React servita da CloudFront; il backend è un'HTTP API di API Gateway che invoca funzioni Lambda; i dati stanno in RDS PostgreSQL, i file in S3, gli utenti in Cognito. Il database vive in una </w:t>
       </w:r>
       <w:r>
         <w:rPr>
@@ -2084,7 +2084,7 @@
         <w:t xml:space="preserve">In basso, la VPC</w:t>
       </w:r>
       <w:r>
-        <w:t xml:space="preserve">: Aurora, l'RDS Proxy, le cinque Lambda di business e gli endpoint VPC, su due sottoreti private in due zone. Qui valgono sia i security group sia IAM.</w:t>
+        <w:t xml:space="preserve">: il database, l'RDS Proxy, le cinque Lambda di business e gli endpoint VPC, su due sottoreti private in due zone. Qui valgono sia i security group sia IAM.</w:t>
       </w:r>
     </w:p>
     <w:p>
@@ -2126,7 +2126,7 @@
         <w:t xml:space="preserve">buyer</w:t>
       </w:r>
       <w:r>
-        <w:t xml:space="preserve">; poi entra nell'RDS Proxy con un token IAM e scrive l'offerta in Aurora. Poi pubblica un evento su SNS, attraverso l'endpoint VPC, e risponde subito al browser. L'email all'agente parte dopo, per conto suo: SNS consegna l'evento alla coda SQS, la Mailer lo legge, chiede a Cognito l'indirizzo dell'agente e invia con SES. Chi autorizza ciascun passaggio è il tema del capitolo 3, flusso per flusso, e del 4.3.</w:t>
+        <w:t xml:space="preserve">; poi entra nell'RDS Proxy con un token IAM e scrive l'offerta nel database. Poi pubblica un evento su SNS, attraverso l'endpoint VPC, e risponde subito al browser. L'email all'agente parte dopo, per conto suo: SNS consegna l'evento alla coda SQS, la Mailer lo legge, chiede a Cognito l'indirizzo dell'agente e invia con SES. Chi autorizza ciascun passaggio è il tema del capitolo 3, flusso per flusso, e del 4.3.</w:t>
       </w:r>
     </w:p>
     <w:p>
@@ -2593,7 +2593,7 @@
                 <w:sz w:val="19"/>
                 <w:szCs w:val="19"/>
               </w:rPr>
-              <w:t xml:space="preserve">API Gateway, Lambda, RDS Proxy, Aurora (3.2, 3.3)</w:t>
+              <w:t xml:space="preserve">API Gateway, Lambda, RDS Proxy, RDS PostgreSQL (3.2, 3.3)</w:t>
             </w:r>
           </w:p>
         </w:tc>
@@ -2751,7 +2751,7 @@
                 <w:sz w:val="19"/>
                 <w:szCs w:val="19"/>
               </w:rPr>
-              <w:t xml:space="preserve">una Lambda per le offerte, con lo stato in Aurora; ogni passaggio pubblica un evento</w:t>
+              <w:t xml:space="preserve">una Lambda per le offerte, con lo stato nel database; ogni passaggio pubblica un evento</w:t>
             </w:r>
           </w:p>
         </w:tc>
@@ -2780,7 +2780,7 @@
                 <w:sz w:val="19"/>
                 <w:szCs w:val="19"/>
               </w:rPr>
-              <w:t xml:space="preserve">Lambda, Aurora, SNS (3.2, 3.3)</w:t>
+              <w:t xml:space="preserve">Lambda, RDS PostgreSQL, SNS (3.2, 3.3)</w:t>
             </w:r>
           </w:p>
         </w:tc>
@@ -2983,7 +2983,7 @@
                 <w:sz w:val="19"/>
                 <w:szCs w:val="19"/>
               </w:rPr>
-              <w:t xml:space="preserve">Cognito, Lambda, Aurora, SNS (3.6)</w:t>
+              <w:t xml:space="preserve">Cognito, Lambda, RDS PostgreSQL, SNS (3.6)</w:t>
             </w:r>
           </w:p>
         </w:tc>
@@ -3328,7 +3328,7 @@
                 <w:sz w:val="19"/>
                 <w:szCs w:val="19"/>
               </w:rPr>
-              <w:t xml:space="preserve">Aurora con writer e reader su due zone, Lambda e proxy su entrambe; le email fallite si ritentano e finiscono in una dead-letter queue sorvegliata</w:t>
+              <w:t xml:space="preserve">database Multi-AZ con standby sincrona, Lambda e proxy su entrambe; le email fallite si ritentano e finiscono in una dead-letter queue sorvegliata</w:t>
             </w:r>
           </w:p>
         </w:tc>
@@ -3357,7 +3357,7 @@
                 <w:sz w:val="19"/>
                 <w:szCs w:val="19"/>
               </w:rPr>
-              <w:t xml:space="preserve">Aurora, VPC, SQS (3.3, 3.5)</w:t>
+              <w:t xml:space="preserve">RDS PostgreSQL, VPC, SQS (3.3, 3.5)</w:t>
             </w:r>
           </w:p>
         </w:tc>
@@ -3606,7 +3606,7 @@
         <w:jc w:val="both"/>
       </w:pPr>
       <w:r>
-        <w:t xml:space="preserve">Il traffico è basso e irregolare, e non vogliamo server da gestire (R8, R9). Lambda e un'HTTP API si pagano per richiesta e scalano da zero; un'applicazione sempre accesa costerebbe anche a vuoto. Il prezzo è il cold start sulle istanze nuove e un codice effimero, che non tiene nulla in memoria tra una richiesta e l'altra: lo stato sta in Aurora e in S3.</w:t>
+        <w:t xml:space="preserve">Il traffico è basso e irregolare, e non vogliamo server da gestire (R8, R9). Lambda e un'HTTP API si pagano per richiesta e scalano da zero; un'applicazione sempre accesa costerebbe anche a vuoto. Il prezzo è il cold start sulle istanze nuove e un codice effimero, che non tiene nulla in memoria tra una richiesta e l'altra: lo stato sta nel database e in S3.</w:t>
       </w:r>
     </w:p>
     <w:p>
@@ -3636,7 +3636,7 @@
         <w:t xml:space="preserve">eu-south-1</w:t>
       </w:r>
       <w:r>
-        <w:t xml:space="preserve">, per tenere i dati in Italia (R12). Dentro la regione la VPC ha due sottoreti in due zone di disponibilità: Aurora e il proxy lo richiedono, e se una zona cade Aurora promuove la reader dell'altra (R11). Non c'è replica su una seconda regione: è un limite dichiarato nel capitolo 5.</w:t>
+        <w:t xml:space="preserve">, per tenere i dati in Italia (R12). Dentro la regione la VPC ha due sottoreti in due zone di disponibilità: il database e il proxy lo richiedono, e se una zona cade RDS promuove la standby dell'altra (R11). Non c'è replica su una seconda regione: è un limite dichiarato nel capitolo 5.</w:t>
       </w:r>
     </w:p>
     <w:p>
@@ -4147,7 +4147,7 @@
                 <w:sz w:val="19"/>
                 <w:szCs w:val="19"/>
               </w:rPr>
-              <w:t xml:space="preserve">RDS Proxy con autenticazione IAM verso Aurora</w:t>
+              <w:t xml:space="preserve">RDS Proxy con autenticazione IAM verso RDS PostgreSQL</w:t>
             </w:r>
           </w:p>
         </w:tc>
@@ -9139,7 +9139,7 @@
         <w:jc w:val="both"/>
       </w:pPr>
       <w:r>
-        <w:t xml:space="preserve">Cinque Lambda su sei usano il database: Property, Users, Offers, Presigned e Files. Il problema è doppio: ogni istanza di una Lambda apre la propria connessione, e con molte invocazioni concorrenti si arriva al limite di PostgreSQL; e collegarsi richiede credenziali, che non vogliamo nel codice. La soluzione è mettere tra le Lambda e il cluster </w:t>
+        <w:t xml:space="preserve">Cinque Lambda su sei usano il database: Property, Users, Offers, Presigned e Files. Il problema è doppio: ogni istanza di una Lambda apre la propria connessione, e con molte invocazioni concorrenti si arriva al limite di PostgreSQL; e collegarsi richiede credenziali, che non vogliamo nel codice. La soluzione è mettere tra le Lambda e il database </w:t>
       </w:r>
       <w:r>
         <w:rPr>
@@ -9148,10 +9148,10 @@
           <w:sz w:val="19"/>
           <w:szCs w:val="19"/>
         </w:rPr>
-        <w:t xml:space="preserve">real-estate-prod-aurora</w:t>
-      </w:r>
-      <w:r>
-        <w:t xml:space="preserve"> l'</w:t>
+        <w:t xml:space="preserve">real-estate-prod-db</w:t>
+      </w:r>
+      <w:r>
+        <w:t xml:space="preserve"> (Amazon RDS for PostgreSQL) l'</w:t>
       </w:r>
       <w:r>
         <w:rPr>
@@ -9173,7 +9173,7 @@
         <w:t xml:space="preserve">real-estate-prod-db-proxy</w:t>
       </w:r>
       <w:r>
-        <w:t xml:space="preserve">, che tiene poche connessioni stabili verso Aurora e ci smista quelle brevi delle Lambda. I due tratti della catena </w:t>
+        <w:t xml:space="preserve">, che tiene poche connessioni stabili verso il database e ci smista quelle brevi delle Lambda. I due tratti della catena </w:t>
       </w:r>
       <w:r>
         <w:rPr>
@@ -9183,7 +9183,7 @@
         <w:t xml:space="preserve">non si autenticano allo stesso modo</w:t>
       </w:r>
       <w:r>
-        <w:t xml:space="preserve">: le Lambda entrano nel proxy con un token IAM, il proxy entra in Aurora con la password dell'utente PostgreSQL, che legge da Secrets Manager con un ruolo suo.</w:t>
+        <w:t xml:space="preserve">: le Lambda entrano nel proxy con un token IAM, il proxy entra nel database con la password dell'utente PostgreSQL, che legge da Secrets Manager con un ruolo suo.</w:t>
       </w:r>
     </w:p>
     <w:p>
@@ -9246,7 +9246,7 @@
           <w:sz w:val="18"/>
           <w:szCs w:val="18"/>
         </w:rPr>
-        <w:t xml:space="preserve">Figura 3.3 — La catena Lambda → RDS Proxy → Aurora, con la lettura dei secret. Gli elementi che non partecipano sono sbiaditi.</w:t>
+        <w:t xml:space="preserve">Figura 3.3 — La catena Lambda → RDS Proxy → RDS PostgreSQL, con la lettura dei secret. Gli elementi che non partecipano sono sbiaditi.</w:t>
       </w:r>
     </w:p>
     <w:p>
@@ -9313,7 +9313,7 @@
         <w:spacing w:after="60" w:line="276"/>
       </w:pPr>
       <w:r>
-        <w:t xml:space="preserve">Il proxy verifica il token con IAM e prende dal pool una connessione verso Aurora; se deve aprirne una nuova, usa la </w:t>
+        <w:t xml:space="preserve">Il proxy verifica il token con IAM e prende dal pool una connessione verso il database; se deve aprirne una nuova, usa la </w:t>
       </w:r>
       <w:r>
         <w:rPr>
@@ -9348,17 +9348,17 @@
         <w:spacing w:after="60" w:line="276"/>
       </w:pPr>
       <w:r>
-        <w:t xml:space="preserve">La query arriva al </w:t>
+        <w:t xml:space="preserve">La query arriva all'istanza </w:t>
       </w:r>
       <w:r>
         <w:rPr>
           <w:b/>
           <w:bCs/>
         </w:rPr>
-        <w:t xml:space="preserve">writer</w:t>
-      </w:r>
-      <w:r>
-        <w:t xml:space="preserve"> del cluster. Da lì decidono i </w:t>
+        <w:t xml:space="preserve">primaria</w:t>
+      </w:r>
+      <w:r>
+        <w:t xml:space="preserve">. Da lì decidono i </w:t>
       </w:r>
       <w:r>
         <w:rPr>
@@ -9855,7 +9855,7 @@
                 <w:sz w:val="19"/>
                 <w:szCs w:val="19"/>
               </w:rPr>
-              <w:t xml:space="preserve">RDS Proxy → Aurora</w:t>
+              <w:t xml:space="preserve">RDS Proxy → RDS PostgreSQL</w:t>
             </w:r>
           </w:p>
         </w:tc>
@@ -11254,7 +11254,7 @@
           <w:b/>
           <w:bCs/>
         </w:rPr>
-        <w:t xml:space="preserve">Entrare in Aurora.</w:t>
+        <w:t xml:space="preserve">Entrare nel database.</w:t>
       </w:r>
       <w:r>
         <w:t xml:space="preserve"> Qui IAM non c'è più: il proxy si presenta con utente e password del secret. Per questo agli utenti applicativi non si assegna il ruolo </w:t>
@@ -11371,7 +11371,7 @@
         <w:t xml:space="preserve">sg-rds</w:t>
       </w:r>
       <w:r>
-        <w:t xml:space="preserve"> sulla 5432, in cui ognuno accetta solo il precedente: le Lambda non raggiungono Aurora direttamente (vedi 4.2).</w:t>
+        <w:t xml:space="preserve"> sulla 5432, in cui ognuno accetta solo il precedente: le Lambda non raggiungono il database direttamente (vedi 4.2).</w:t>
       </w:r>
     </w:p>
     <w:p>
@@ -11389,14 +11389,24 @@
         <w:jc w:val="both"/>
       </w:pPr>
       <w:r>
-        <w:t xml:space="preserve">Il cluster ha un'istanza </w:t>
+        <w:t xml:space="preserve">Il database è </w:t>
       </w:r>
       <w:r>
         <w:rPr>
           <w:b/>
           <w:bCs/>
         </w:rPr>
-        <w:t xml:space="preserve">writer</w:t>
+        <w:t xml:space="preserve">Multi-AZ</w:t>
+      </w:r>
+      <w:r>
+        <w:t xml:space="preserve">: la </w:t>
+      </w:r>
+      <w:r>
+        <w:rPr>
+          <w:b/>
+          <w:bCs/>
+        </w:rPr>
+        <w:t xml:space="preserve">primaria</w:t>
       </w:r>
       <w:r>
         <w:t xml:space="preserve"> in </w:t>
@@ -11411,14 +11421,14 @@
         <w:t xml:space="preserve">eu-south-1a</w:t>
       </w:r>
       <w:r>
-        <w:t xml:space="preserve"> e una </w:t>
+        <w:t xml:space="preserve"> serve le richieste, la </w:t>
       </w:r>
       <w:r>
         <w:rPr>
           <w:b/>
           <w:bCs/>
         </w:rPr>
-        <w:t xml:space="preserve">reader</w:t>
+        <w:t xml:space="preserve">standby</w:t>
       </w:r>
       <w:r>
         <w:t xml:space="preserve"> in </w:t>
@@ -11433,7 +11443,17 @@
         <w:t xml:space="preserve">eu-south-1b</w:t>
       </w:r>
       <w:r>
-        <w:t xml:space="preserve">; i dati stanno in un volume condiviso su tre AZ, quindi la reader può diventare writer senza copiare nulla. Il proxy ha come target il cluster, non un'istanza: se il writer cade e Aurora promuove la reader, in genere in decine di secondi, il proxy tiene aperte le connessioni delle Lambda e si ricollega al nuovo writer, e il failover che le Lambda percepiscono è più breve. Oggi la reader serve solo a questo (5.2).</w:t>
+        <w:t xml:space="preserve"> ne riceve ogni scrittura in modo </w:t>
+      </w:r>
+      <w:r>
+        <w:rPr>
+          <w:b/>
+          <w:bCs/>
+        </w:rPr>
+        <w:t xml:space="preserve">sincrono</w:t>
+      </w:r>
+      <w:r>
+        <w:t xml:space="preserve"> e non serve letture. Se la primaria cade, RDS promuove la standby sullo stesso endpoint DNS, in genere in uno o due minuti, senza perdere transazioni confermate. Il proxy tiene aperte le connessioni delle Lambda e si ricollega alla nuova primaria: l'interruzione percepita dovrebbe ridursi.</w:t>
       </w:r>
     </w:p>
     <w:p>
@@ -11517,7 +11537,7 @@
         <w:jc w:val="both"/>
       </w:pPr>
       <w:r>
-        <w:t xml:space="preserve">Con il traffico del progetto il proxy non è strettamente necessario: lo teniamo perché ci dà il pool condiviso, l'autenticazione IAM e un failover più breve. Tra proxy e Aurora usiamo la password da Secrets Manager e non l'autenticazione IAM end-to-end, perché è la modalità più documentata e lascia la password a un solo componente. Un utente e un secret per Lambda portano il minimo privilegio anche dentro il database. Le alternative scartate sono nel capitolo 5.</w:t>
+        <w:t xml:space="preserve">Con il traffico del progetto il proxy non è strettamente necessario: lo teniamo perché ci dà il pool condiviso, l'autenticazione IAM e un failover più breve. Tra proxy e database usiamo la password da Secrets Manager e non l'autenticazione IAM end-to-end, perché è la modalità più documentata e lascia la password a un solo componente. Un utente e un secret per Lambda portano il minimo privilegio anche dentro il database. Le alternative scartate sono nel capitolo 5.</w:t>
       </w:r>
     </w:p>
     <w:p>
@@ -20692,7 +20712,7 @@
                 <w:sz w:val="19"/>
                 <w:szCs w:val="19"/>
               </w:rPr>
-              <w:t xml:space="preserve">Users Lambda → RDS Proxy → Aurora</w:t>
+              <w:t xml:space="preserve">Users Lambda → RDS Proxy → database</w:t>
             </w:r>
           </w:p>
         </w:tc>
@@ -21758,7 +21778,7 @@
         <w:spacing w:after="60" w:line="276"/>
       </w:pPr>
       <w:r>
-        <w:t xml:space="preserve">I servizi pubblicano le loro metriche: errori delle Lambda, CPU e connessioni di Aurora, età dei messaggi nelle code.</w:t>
+        <w:t xml:space="preserve">I servizi pubblicano le loro metriche: errori delle Lambda, CPU e connessioni del database, età dei messaggi nelle code.</w:t>
       </w:r>
     </w:p>
     <w:p>
@@ -22825,7 +22845,7 @@
                 <w:sz w:val="19"/>
                 <w:szCs w:val="19"/>
               </w:rPr>
-              <w:t xml:space="preserve">CPU e connessioni di Aurora</w:t>
+              <w:t xml:space="preserve">CPU e connessioni del database</w:t>
             </w:r>
           </w:p>
         </w:tc>
@@ -22945,7 +22965,7 @@
         <w:jc w:val="both"/>
       </w:pPr>
       <w:r>
-        <w:t xml:space="preserve">Se nessuno conferma la sottoscrizione email, gli allarmi non arrivano: è la prima cosa da verificare. Le soglie di Aurora sono ancora da fissare. Gli allarmi coprono il backend, non l'esperienza nel browser.</w:t>
+        <w:t xml:space="preserve">Se nessuno conferma la sottoscrizione email, gli allarmi non arrivano: è la prima cosa da verificare. Le soglie del database sono ancora da fissare. Gli allarmi coprono il backend, non l'esperienza nel browser.</w:t>
       </w:r>
     </w:p>
     <w:p>
@@ -24617,7 +24637,7 @@
         <w:t xml:space="preserve">eu-south-1b</w:t>
       </w:r>
       <w:r>
-        <w:t xml:space="preserve">, hanno solo la rotta locale e quella verso il gateway S3. Dentro ci sono solo Aurora, l'RDS Proxy, le interfacce di rete delle cinque Lambda di business e gli interface endpoint; perché niente NAT e perché due zone lo spiega il 2.3.</w:t>
+        <w:t xml:space="preserve">, hanno solo la rotta locale e quella verso il gateway S3. Dentro ci sono solo il database, l'RDS Proxy, le interfacce di rete delle cinque Lambda di business e gli interface endpoint; perché niente NAT e perché due zone lo spiega il 2.3.</w:t>
       </w:r>
     </w:p>
     <w:p>
@@ -24955,7 +24975,7 @@
                 <w:sz w:val="19"/>
                 <w:szCs w:val="19"/>
               </w:rPr>
-              <w:t xml:space="preserve">5432 → Aurora; 443 → endpoint Secrets Manager</w:t>
+              <w:t xml:space="preserve">5432 → database; 443 → endpoint Secrets Manager</w:t>
             </w:r>
           </w:p>
         </w:tc>
@@ -24998,7 +25018,7 @@
                 <w:sz w:val="19"/>
                 <w:szCs w:val="19"/>
               </w:rPr>
-              <w:t xml:space="preserve"> (Aurora)</w:t>
+              <w:t xml:space="preserve"> (database)</w:t>
             </w:r>
           </w:p>
         </w:tc>
@@ -25265,7 +25285,7 @@
         <w:jc w:val="both"/>
       </w:pPr>
       <w:r>
-        <w:t xml:space="preserve">Le Lambda non raggiungono Aurora direttamente, nessuno entra nelle Lambda, e ogni endpoint accetta solo chi lo usa.</w:t>
+        <w:t xml:space="preserve">Le Lambda non raggiungono il database direttamente, nessuno entra nelle Lambda, e ogni endpoint accetta solo chi lo usa.</w:t>
       </w:r>
     </w:p>
     <w:p>
@@ -26642,7 +26662,7 @@
                 <w:sz w:val="19"/>
                 <w:szCs w:val="19"/>
               </w:rPr>
-              <w:t xml:space="preserve">Proxy → Aurora</w:t>
+              <w:t xml:space="preserve">Proxy → database</w:t>
             </w:r>
           </w:p>
         </w:tc>
@@ -29408,7 +29428,7 @@
                 <w:sz w:val="19"/>
                 <w:szCs w:val="19"/>
               </w:rPr>
-              <w:t xml:space="preserve">connessione diretta ad Aurora, con rischio di esaurire le connessioni</w:t>
+              <w:t xml:space="preserve">connessione diretta al database, con rischio di esaurire le connessioni</w:t>
             </w:r>
           </w:p>
         </w:tc>
@@ -29442,7 +29462,7 @@
                 <w:sz w:val="19"/>
                 <w:szCs w:val="19"/>
               </w:rPr>
-              <w:t xml:space="preserve">Aurora con writer e reader su due zone</w:t>
+              <w:t xml:space="preserve">RDS PostgreSQL Multi-AZ, primaria e standby sincrona (indicazione del docente)</w:t>
             </w:r>
           </w:p>
         </w:tc>
@@ -29471,7 +29491,7 @@
                 <w:sz w:val="19"/>
                 <w:szCs w:val="19"/>
               </w:rPr>
-              <w:t xml:space="preserve">failover automatico se cade una zona</w:t>
+              <w:t xml:space="preserve">failover automatico se cade una zona; costo minore, gestione più semplice</w:t>
             </w:r>
           </w:p>
         </w:tc>
@@ -29500,7 +29520,7 @@
                 <w:sz w:val="19"/>
                 <w:szCs w:val="19"/>
               </w:rPr>
-              <w:t xml:space="preserve">Aurora Serverless v2; RDS Multi-AZ</w:t>
+              <w:t xml:space="preserve">Aurora con writer e reader (prima scelta): la reader serviva solo al failover; Multi-AZ DB cluster, più costoso; Single-AZ, senza HA</w:t>
             </w:r>
           </w:p>
         </w:tc>
@@ -29886,7 +29906,7 @@
         <w:t xml:space="preserve">Configurazione mai provata.</w:t>
       </w:r>
       <w:r>
-        <w:t xml:space="preserve"> La relazione descrive la configurazione prevista: nessuna risorsa è stata creata. Connessione al proxy, failover del writer e Content-Security-Policy si verificano solo creandole.</w:t>
+        <w:t xml:space="preserve"> La relazione descrive la configurazione prevista: nessuna risorsa è stata creata. Connessione al proxy, failover del database e Content-Security-Policy si verificano solo creandole.</w:t>
       </w:r>
     </w:p>
     <w:p>
@@ -29926,7 +29946,7 @@
         <w:t xml:space="preserve">Costo fisso.</w:t>
       </w:r>
       <w:r>
-        <w:t xml:space="preserve"> Aurora, il proxy e gli interface endpoint costano anche a vuoto: è la parte che non segue R8. Una stima con il Pricing Calculator non l'abbiamo ancora fatta.</w:t>
+        <w:t xml:space="preserve"> Il database, il proxy e gli interface endpoint costano anche a vuoto: è la parte che non segue R8. Una stima con il Pricing Calculator non l'abbiamo ancora fatta.</w:t>
       </w:r>
     </w:p>
     <w:p>
@@ -29963,10 +29983,10 @@
           <w:b/>
           <w:bCs/>
         </w:rPr>
-        <w:t xml:space="preserve">La reader di Aurora</w:t>
-      </w:r>
-      <w:r>
-        <w:t xml:space="preserve"> serve solo al failover: le letture vanno tutte al writer.</w:t>
+        <w:t xml:space="preserve">Failover non istantaneo.</w:t>
+      </w:r>
+      <w:r>
+        <w:t xml:space="preserve"> Per uno o due minuti le scritture si fermano.</w:t>
       </w:r>
     </w:p>
     <w:p>
@@ -30038,7 +30058,7 @@
         <w:t xml:space="preserve">sub</w:t>
       </w:r>
       <w:r>
-        <w:t xml:space="preserve">, gli immobili ritirati con i loro file, il profilo nei backup di Aurora fino alla fine della retention (3.6).</w:t>
+        <w:t xml:space="preserve">, gli immobili ritirati con i loro file, il profilo nei backup del database fino alla fine della retention (3.6).</w:t>
       </w:r>
     </w:p>
     <w:p>
@@ -30166,29 +30186,6 @@
       </w:r>
       <w:r>
         <w:t xml:space="preserve"> dei secret.</w:t>
-      </w:r>
-    </w:p>
-    <w:p>
-      <w:pPr>
-        <w:pStyle w:val="ListParagraph"/>
-        <w:numPr>
-          <w:ilvl w:val="0"/>
-          <w:numId w:val="2"/>
-        </w:numPr>
-        <w:spacing w:after="60" w:line="276"/>
-      </w:pPr>
-      <w:r>
-        <w:t xml:space="preserve">Un endpoint di sola lettura del proxy per </w:t>
-      </w:r>
-      <w:r>
-        <w:rPr>
-          <w:b/>
-          <w:bCs/>
-        </w:rPr>
-        <w:t xml:space="preserve">usare la reader</w:t>
-      </w:r>
-      <w:r>
-        <w:t xml:space="preserve">, o Aurora Serverless v2 per pagare solo la capacità usata.</w:t>
       </w:r>
     </w:p>
     <w:p>

</xml_diff>

<commit_message>
Database: PostgreSQL 18 invece della 17, con il motivo (ultima major su RDS, supportata da RDS Proxy a Milano, supporto standard fino a febbraio 2031; la 19 non è ancora su RDS)
</commit_message>
<xml_diff>
--- a/relazione/relazione.docx
+++ b/relazione/relazione.docx
@@ -119,7 +119,7 @@
       </w:r>
     </w:p>
     <w:p>
-      <w:hyperlink w:history="1" r:id="rIdcyjtcalgt2d-h71knc8oo">
+      <w:hyperlink w:history="1" r:id="rId0ep7s6c041fyt2nnfw5rl">
         <w:r>
           <w:rPr>
             <w:rStyle w:val="Hyperlink"/>
@@ -11454,6 +11454,26 @@
       </w:r>
       <w:r>
         <w:t xml:space="preserve"> e non serve letture. Se la primaria cade, RDS promuove la standby sullo stesso endpoint DNS, in genere in uno o due minuti, senza perdere transazioni confermate. Il proxy tiene aperte le connessioni delle Lambda e si ricollega alla nuova primaria: l'interruzione percepita dovrebbe ridursi.</w:t>
+      </w:r>
+    </w:p>
+    <w:p>
+      <w:pPr>
+        <w:keepNext w:val="false"/>
+        <w:spacing w:after="120" w:line="276"/>
+        <w:jc w:val="both"/>
+      </w:pPr>
+      <w:r>
+        <w:t xml:space="preserve">Il motore è </w:t>
+      </w:r>
+      <w:r>
+        <w:rPr>
+          <w:b/>
+          <w:bCs/>
+        </w:rPr>
+        <w:t xml:space="preserve">PostgreSQL 18</w:t>
+      </w:r>
+      <w:r>
+        <w:t xml:space="preserve">, la versione principale più recente disponibile su RDS e supportata da RDS Proxy a Milano: rispetto alla 17 ha un anno in più di supporto standard (fino a febbraio 2031), mentre la 19 non è ancora disponibile su RDS.</w:t>
       </w:r>
     </w:p>
     <w:p>

</xml_diff>